<commit_message>
Finalisasi laporan dan koreksi durasi menit-detik
Sampul Kelompok 5, pemenggalan contoh output, konversi M.SS sesuai tugas sebelumnya, 77 pemeriksaan lulus, keluaran uji ulang aktual dan paket ZIP yang konsisten.
</commit_message>
<xml_diff>
--- a/Laporan_PlaylistRekursif_Kelompok5.docx
+++ b/Laporan_PlaylistRekursif_Kelompok5.docx
@@ -1925,7 +1925,7 @@
                 <w:rFonts w:ascii="Times New Roman" w:hAnsi="Times New Roman"/>
                 <w:sz w:val="24"/>
                 <w:szCs w:val="24"/>
-                <w:lang w:val="en-ID"/>
+                <w:lang w:val="en-US"/>
               </w:rPr>
               <w:t>Waktu O(n); ruang O(n)</w:t>
             </w:r>
@@ -1978,7 +1978,7 @@
                 <w:rFonts w:ascii="Times New Roman" w:hAnsi="Times New Roman"/>
                 <w:sz w:val="24"/>
                 <w:szCs w:val="24"/>
-                <w:lang w:val="en-ID"/>
+                <w:lang w:val="en-US"/>
               </w:rPr>
               <w:t>n == 0; berhenti</w:t>
             </w:r>
@@ -2020,7 +2020,7 @@
                 <w:rFonts w:ascii="Times New Roman" w:hAnsi="Times New Roman"/>
                 <w:sz w:val="24"/>
                 <w:szCs w:val="24"/>
-                <w:lang w:val="en-ID"/>
+                <w:lang w:val="en-US"/>
               </w:rPr>
               <w:t>Waktu O(n); ruang O(n)</w:t>
             </w:r>
@@ -2115,7 +2115,7 @@
                 <w:rFonts w:ascii="Times New Roman" w:hAnsi="Times New Roman"/>
                 <w:sz w:val="24"/>
                 <w:szCs w:val="24"/>
-                <w:lang w:val="en-ID"/>
+                <w:lang w:val="en-US"/>
               </w:rPr>
               <w:t>Waktu O(n); ruang O(n)</w:t>
             </w:r>
@@ -2407,39 +2407,6 @@
         </w:rPr>
         <w:t>Bandingkan hasil waktu eksekusi dan buat tabel analisis di laporan:</w:t>
       </w:r>
-    </w:p>
-    <w:p xmlns:wp14="http://schemas.microsoft.com/office/word/2010/wordml" wp14:textId="77777777">
-      <w:pPr>
-        <w:spacing w:after="120"/>
-        <w:rPr>
-          <w:rFonts w:ascii="Times New Roman" w:hAnsi="Times New Roman" w:eastAsia="Times New Roman"/>
-          <w:sz w:val="24"/>
-          <w:szCs w:val="24"/>
-          <w:lang w:val="en-ID" w:eastAsia="en-ID"/>
-        </w:rPr>
-      </w:pPr>
-    </w:p>
-    <w:p xmlns:wp14="http://schemas.microsoft.com/office/word/2010/wordml" wp14:textId="77777777">
-      <w:pPr>
-        <w:spacing w:after="120"/>
-        <w:rPr>
-          <w:rFonts w:ascii="Times New Roman" w:hAnsi="Times New Roman" w:eastAsia="Times New Roman"/>
-          <w:sz w:val="24"/>
-          <w:szCs w:val="24"/>
-          <w:lang w:val="en-ID" w:eastAsia="en-ID"/>
-        </w:rPr>
-      </w:pPr>
-    </w:p>
-    <w:p xmlns:wp14="http://schemas.microsoft.com/office/word/2010/wordml" wp14:textId="77777777">
-      <w:pPr>
-        <w:spacing w:after="120"/>
-        <w:rPr>
-          <w:rFonts w:ascii="Times New Roman" w:hAnsi="Times New Roman" w:eastAsia="Times New Roman"/>
-          <w:sz w:val="24"/>
-          <w:szCs w:val="24"/>
-          <w:lang w:val="en-ID" w:eastAsia="en-ID"/>
-        </w:rPr>
-      </w:pPr>
     </w:p>
     <w:p xmlns:wp14="http://schemas.microsoft.com/office/word/2010/wordml" wp14:textId="77777777">
       <w:pPr>
@@ -3378,8 +3345,478 @@
         </w:tc>
       </w:tr>
     </w:tbl>
-    <w:p xmlns:wp14="http://schemas.microsoft.com/office/word/2010/wordml" wp14:textId="77777777">
-      <w:pPr>
+    <w:p>
+      <w:pPr>
+        <w:spacing w:before="240" w:beforeAutospacing="off" w:after="280" w:afterAutospacing="off" w:line="288" w:lineRule="auto"/>
+        <w:ind/>
+        <w:jc w:val="center"/>
+        <w:pageBreakBefore w:val="1"/>
+      </w:pPr>
+      <w:r>
+        <w:rPr>
+          <w:rFonts w:ascii="Times New Roman" w:hAnsi="Times New Roman" w:eastAsia="Times New Roman" w:cs="Times New Roman"/>
+          <w:b w:val="1"/>
+          <w:bCs w:val="1"/>
+          <w:noProof w:val="0"/>
+          <w:color w:val="000000" w:themeColor="text1" w:themeTint="FF" w:themeShade="FF"/>
+          <w:sz w:val="28"/>
+          <w:szCs w:val="28"/>
+          <w:lang w:val="en-US"/>
+        </w:rPr>
+        <w:t>LAPORAN TUGAS KELOMPOK 3</w:t>
+      </w:r>
+    </w:p>
+    <w:p>
+      <w:pPr>
+        <w:spacing w:before="0" w:beforeAutospacing="off" w:after="1920" w:afterAutospacing="off" w:line="288" w:lineRule="auto"/>
+        <w:ind/>
+        <w:jc w:val="center"/>
+      </w:pPr>
+      <w:r>
+        <w:rPr>
+          <w:rFonts w:ascii="Times New Roman" w:hAnsi="Times New Roman" w:eastAsia="Times New Roman" w:cs="Times New Roman"/>
+          <w:b w:val="1"/>
+          <w:bCs w:val="1"/>
+          <w:noProof w:val="0"/>
+          <w:color w:val="000000" w:themeColor="text1" w:themeTint="FF" w:themeShade="FF"/>
+          <w:sz w:val="28"/>
+          <w:szCs w:val="28"/>
+          <w:lang w:val="en-US"/>
+        </w:rPr>
+        <w:t>ANALISIS ALGORITMA DAN FUNGSI REKURSIF PADA PLAYLIST</w:t>
+      </w:r>
+    </w:p>
+    <w:p>
+      <w:pPr>
+        <w:spacing w:before="0" w:beforeAutospacing="off" w:after="200" w:afterAutospacing="off" w:line="288" w:lineRule="auto"/>
+        <w:ind/>
+        <w:jc w:val="center"/>
+      </w:pPr>
+      <w:r>
+        <w:rPr>
+          <w:rFonts w:ascii="Times New Roman" w:hAnsi="Times New Roman" w:eastAsia="Times New Roman" w:cs="Times New Roman"/>
+          <w:b w:val="1"/>
+          <w:bCs w:val="1"/>
+          <w:noProof w:val="0"/>
+          <w:color w:val="000000" w:themeColor="text1" w:themeTint="FF" w:themeShade="FF"/>
+          <w:sz w:val="24"/>
+          <w:szCs w:val="24"/>
+          <w:lang w:val="en-US"/>
+        </w:rPr>
+        <w:t>Disusun oleh</w:t>
+      </w:r>
+    </w:p>
+    <w:p>
+      <w:pPr>
+        <w:spacing w:before="0" w:beforeAutospacing="off" w:after="280" w:afterAutospacing="off" w:line="288" w:lineRule="auto"/>
+        <w:ind/>
+        <w:jc w:val="center"/>
+      </w:pPr>
+      <w:r>
+        <w:rPr>
+          <w:rFonts w:ascii="Times New Roman" w:hAnsi="Times New Roman" w:eastAsia="Times New Roman" w:cs="Times New Roman"/>
+          <w:noProof w:val="0"/>
+          <w:color w:val="000000" w:themeColor="text1" w:themeTint="FF" w:themeShade="FF"/>
+          <w:sz w:val="24"/>
+          <w:szCs w:val="24"/>
+          <w:lang w:val="en-US"/>
+        </w:rPr>
+        <w:t>Kelompok 5</w:t>
+      </w:r>
+    </w:p>
+    <w:tbl>
+      <w:tblPr>
+        <w:tblStyle w:val="TableNormal"/>
+        <w:bidiVisual w:val="0"/>
+        <w:tblW w:w="0" w:type="auto"/>
+        <w:tblLook w:val="06A0" w:firstRow="1" w:lastRow="0" w:firstColumn="1" w:lastColumn="0" w:noHBand="1" w:noVBand="1"/>
+      </w:tblPr>
+      <w:tblGrid>
+        <w:gridCol w:w="5325"/>
+        <w:gridCol w:w="2475"/>
+      </w:tblGrid>
+      <w:tr>
+        <w:trPr>
+          <w:trHeight w:val="300"/>
+        </w:trPr>
+        <w:tc>
+          <w:tcPr>
+            <w:tcW w:w="5325" w:type="dxa"/>
+            <w:tcBorders>
+              <w:top w:val="nil"/>
+              <w:left w:val="nil"/>
+              <w:bottom w:val="nil"/>
+              <w:right w:val="nil"/>
+            </w:tcBorders>
+            <w:tcMar/>
+            <w:vAlign w:val="center"/>
+          </w:tcPr>
+          <w:p>
+            <w:pPr>
+              <w:spacing w:before="0" w:beforeAutospacing="off" w:after="160" w:afterAutospacing="off" w:line="288" w:lineRule="auto"/>
+              <w:jc w:val="left"/>
+            </w:pPr>
+            <w:r>
+              <w:rPr>
+                <w:rFonts w:ascii="Times New Roman" w:hAnsi="Times New Roman" w:eastAsia="Times New Roman" w:cs="Times New Roman"/>
+                <w:color w:val="000000" w:themeColor="text1" w:themeTint="FF" w:themeShade="FF"/>
+                <w:sz w:val="24"/>
+                <w:szCs w:val="24"/>
+              </w:rPr>
+              <w:t>Alfira Putri Nurlita</w:t>
+            </w:r>
+          </w:p>
+        </w:tc>
+        <w:tc>
+          <w:tcPr>
+            <w:tcW w:w="2475" w:type="dxa"/>
+            <w:tcBorders>
+              <w:top w:val="nil"/>
+              <w:left w:val="nil"/>
+              <w:bottom w:val="nil"/>
+              <w:right w:val="nil"/>
+            </w:tcBorders>
+            <w:tcMar/>
+            <w:vAlign w:val="center"/>
+          </w:tcPr>
+          <w:p>
+            <w:pPr>
+              <w:spacing w:before="0" w:beforeAutospacing="off" w:after="160" w:afterAutospacing="off" w:line="288" w:lineRule="auto"/>
+              <w:jc w:val="left"/>
+            </w:pPr>
+            <w:r>
+              <w:rPr>
+                <w:rFonts w:ascii="Times New Roman" w:hAnsi="Times New Roman" w:eastAsia="Times New Roman" w:cs="Times New Roman"/>
+                <w:color w:val="000000" w:themeColor="text1" w:themeTint="FF" w:themeShade="FF"/>
+                <w:sz w:val="24"/>
+                <w:szCs w:val="24"/>
+              </w:rPr>
+              <w:t>2902814942</w:t>
+            </w:r>
+          </w:p>
+        </w:tc>
+      </w:tr>
+      <w:tr>
+        <w:trPr>
+          <w:trHeight w:val="300"/>
+        </w:trPr>
+        <w:tc>
+          <w:tcPr>
+            <w:tcW w:w="5325" w:type="dxa"/>
+            <w:tcBorders>
+              <w:top w:val="nil"/>
+              <w:left w:val="nil"/>
+              <w:bottom w:val="nil"/>
+              <w:right w:val="nil"/>
+            </w:tcBorders>
+            <w:tcMar/>
+            <w:vAlign w:val="center"/>
+          </w:tcPr>
+          <w:p>
+            <w:pPr>
+              <w:spacing w:before="0" w:beforeAutospacing="off" w:after="160" w:afterAutospacing="off" w:line="288" w:lineRule="auto"/>
+              <w:jc w:val="left"/>
+            </w:pPr>
+            <w:r>
+              <w:rPr>
+                <w:rFonts w:ascii="Times New Roman" w:hAnsi="Times New Roman" w:eastAsia="Times New Roman" w:cs="Times New Roman"/>
+                <w:color w:val="000000" w:themeColor="text1" w:themeTint="FF" w:themeShade="FF"/>
+                <w:sz w:val="24"/>
+                <w:szCs w:val="24"/>
+              </w:rPr>
+              <w:t>Khenaro Daffa Asyrof</w:t>
+            </w:r>
+          </w:p>
+        </w:tc>
+        <w:tc>
+          <w:tcPr>
+            <w:tcW w:w="2475" w:type="dxa"/>
+            <w:tcBorders>
+              <w:top w:val="nil"/>
+              <w:left w:val="nil"/>
+              <w:bottom w:val="nil"/>
+              <w:right w:val="nil"/>
+            </w:tcBorders>
+            <w:tcMar/>
+            <w:vAlign w:val="center"/>
+          </w:tcPr>
+          <w:p>
+            <w:pPr>
+              <w:spacing w:before="0" w:beforeAutospacing="off" w:after="160" w:afterAutospacing="off" w:line="288" w:lineRule="auto"/>
+              <w:jc w:val="left"/>
+            </w:pPr>
+            <w:r>
+              <w:rPr>
+                <w:rFonts w:ascii="Times New Roman" w:hAnsi="Times New Roman" w:eastAsia="Times New Roman" w:cs="Times New Roman"/>
+                <w:color w:val="000000" w:themeColor="text1" w:themeTint="FF" w:themeShade="FF"/>
+                <w:sz w:val="24"/>
+                <w:szCs w:val="24"/>
+              </w:rPr>
+              <w:t>2902824590</w:t>
+            </w:r>
+          </w:p>
+        </w:tc>
+      </w:tr>
+      <w:tr>
+        <w:trPr>
+          <w:trHeight w:val="300"/>
+        </w:trPr>
+        <w:tc>
+          <w:tcPr>
+            <w:tcW w:w="5325" w:type="dxa"/>
+            <w:tcBorders>
+              <w:top w:val="nil"/>
+              <w:left w:val="nil"/>
+              <w:bottom w:val="nil"/>
+              <w:right w:val="nil"/>
+            </w:tcBorders>
+            <w:tcMar/>
+            <w:vAlign w:val="center"/>
+          </w:tcPr>
+          <w:p>
+            <w:pPr>
+              <w:spacing w:before="0" w:beforeAutospacing="off" w:after="160" w:afterAutospacing="off" w:line="288" w:lineRule="auto"/>
+              <w:jc w:val="left"/>
+            </w:pPr>
+            <w:r>
+              <w:rPr>
+                <w:rFonts w:ascii="Times New Roman" w:hAnsi="Times New Roman" w:eastAsia="Times New Roman" w:cs="Times New Roman"/>
+                <w:color w:val="000000" w:themeColor="text1" w:themeTint="FF" w:themeShade="FF"/>
+                <w:sz w:val="24"/>
+                <w:szCs w:val="24"/>
+              </w:rPr>
+              <w:t>M Taufan Ariq Hafizh</w:t>
+            </w:r>
+          </w:p>
+        </w:tc>
+        <w:tc>
+          <w:tcPr>
+            <w:tcW w:w="2475" w:type="dxa"/>
+            <w:tcBorders>
+              <w:top w:val="nil"/>
+              <w:left w:val="nil"/>
+              <w:bottom w:val="nil"/>
+              <w:right w:val="nil"/>
+            </w:tcBorders>
+            <w:tcMar/>
+            <w:vAlign w:val="center"/>
+          </w:tcPr>
+          <w:p>
+            <w:pPr>
+              <w:spacing w:before="0" w:beforeAutospacing="off" w:after="160" w:afterAutospacing="off" w:line="288" w:lineRule="auto"/>
+              <w:jc w:val="left"/>
+            </w:pPr>
+            <w:r>
+              <w:rPr>
+                <w:rFonts w:ascii="Times New Roman" w:hAnsi="Times New Roman" w:eastAsia="Times New Roman" w:cs="Times New Roman"/>
+                <w:color w:val="000000" w:themeColor="text1" w:themeTint="FF" w:themeShade="FF"/>
+                <w:sz w:val="24"/>
+                <w:szCs w:val="24"/>
+              </w:rPr>
+              <w:t>2902821254</w:t>
+            </w:r>
+          </w:p>
+        </w:tc>
+      </w:tr>
+      <w:tr>
+        <w:trPr>
+          <w:trHeight w:val="300"/>
+        </w:trPr>
+        <w:tc>
+          <w:tcPr>
+            <w:tcW w:w="5325" w:type="dxa"/>
+            <w:tcBorders>
+              <w:top w:val="nil"/>
+              <w:left w:val="nil"/>
+              <w:bottom w:val="nil"/>
+              <w:right w:val="nil"/>
+            </w:tcBorders>
+            <w:tcMar/>
+            <w:vAlign w:val="center"/>
+          </w:tcPr>
+          <w:p>
+            <w:pPr>
+              <w:spacing w:before="0" w:beforeAutospacing="off" w:after="160" w:afterAutospacing="off" w:line="288" w:lineRule="auto"/>
+              <w:jc w:val="left"/>
+            </w:pPr>
+            <w:r>
+              <w:rPr>
+                <w:rFonts w:ascii="Times New Roman" w:hAnsi="Times New Roman" w:eastAsia="Times New Roman" w:cs="Times New Roman"/>
+                <w:color w:val="000000" w:themeColor="text1" w:themeTint="FF" w:themeShade="FF"/>
+                <w:sz w:val="24"/>
+                <w:szCs w:val="24"/>
+              </w:rPr>
+              <w:t>Risky Saputra Siahaan</w:t>
+            </w:r>
+          </w:p>
+        </w:tc>
+        <w:tc>
+          <w:tcPr>
+            <w:tcW w:w="2475" w:type="dxa"/>
+            <w:tcBorders>
+              <w:top w:val="nil"/>
+              <w:left w:val="nil"/>
+              <w:bottom w:val="nil"/>
+              <w:right w:val="nil"/>
+            </w:tcBorders>
+            <w:tcMar/>
+            <w:vAlign w:val="center"/>
+          </w:tcPr>
+          <w:p>
+            <w:pPr>
+              <w:spacing w:before="0" w:beforeAutospacing="off" w:after="160" w:afterAutospacing="off" w:line="288" w:lineRule="auto"/>
+              <w:jc w:val="left"/>
+            </w:pPr>
+            <w:r>
+              <w:rPr>
+                <w:rFonts w:ascii="Times New Roman" w:hAnsi="Times New Roman" w:eastAsia="Times New Roman" w:cs="Times New Roman"/>
+                <w:color w:val="000000" w:themeColor="text1" w:themeTint="FF" w:themeShade="FF"/>
+                <w:sz w:val="24"/>
+                <w:szCs w:val="24"/>
+              </w:rPr>
+              <w:t>2902816222</w:t>
+            </w:r>
+          </w:p>
+        </w:tc>
+      </w:tr>
+      <w:tr>
+        <w:trPr>
+          <w:trHeight w:val="300"/>
+        </w:trPr>
+        <w:tc>
+          <w:tcPr>
+            <w:tcW w:w="5325" w:type="dxa"/>
+            <w:tcBorders>
+              <w:top w:val="nil"/>
+              <w:left w:val="nil"/>
+              <w:bottom w:val="nil"/>
+              <w:right w:val="nil"/>
+            </w:tcBorders>
+            <w:tcMar/>
+            <w:vAlign w:val="center"/>
+          </w:tcPr>
+          <w:p>
+            <w:pPr>
+              <w:spacing w:before="0" w:beforeAutospacing="off" w:after="160" w:afterAutospacing="off" w:line="288" w:lineRule="auto"/>
+              <w:jc w:val="left"/>
+            </w:pPr>
+            <w:r>
+              <w:rPr>
+                <w:rFonts w:ascii="Times New Roman" w:hAnsi="Times New Roman" w:eastAsia="Times New Roman" w:cs="Times New Roman"/>
+                <w:color w:val="000000" w:themeColor="text1" w:themeTint="FF" w:themeShade="FF"/>
+                <w:sz w:val="24"/>
+                <w:szCs w:val="24"/>
+              </w:rPr>
+              <w:t>Adinda Diva Latifah</w:t>
+            </w:r>
+          </w:p>
+        </w:tc>
+        <w:tc>
+          <w:tcPr>
+            <w:tcW w:w="2475" w:type="dxa"/>
+            <w:tcBorders>
+              <w:top w:val="nil"/>
+              <w:left w:val="nil"/>
+              <w:bottom w:val="nil"/>
+              <w:right w:val="nil"/>
+            </w:tcBorders>
+            <w:tcMar/>
+            <w:vAlign w:val="center"/>
+          </w:tcPr>
+          <w:p>
+            <w:pPr>
+              <w:spacing w:before="0" w:beforeAutospacing="off" w:after="160" w:afterAutospacing="off" w:line="288" w:lineRule="auto"/>
+              <w:jc w:val="left"/>
+            </w:pPr>
+            <w:r>
+              <w:rPr>
+                <w:rFonts w:ascii="Times New Roman" w:hAnsi="Times New Roman" w:eastAsia="Times New Roman" w:cs="Times New Roman"/>
+                <w:color w:val="000000" w:themeColor="text1" w:themeTint="FF" w:themeShade="FF"/>
+                <w:sz w:val="24"/>
+                <w:szCs w:val="24"/>
+              </w:rPr>
+              <w:t>2902827270</w:t>
+            </w:r>
+          </w:p>
+        </w:tc>
+      </w:tr>
+    </w:tbl>
+    <w:p>
+      <w:pPr>
+        <w:bidi w:val="0"/>
+        <w:spacing w:before="1200" w:beforeAutospacing="off" w:after="160" w:afterAutospacing="off" w:line="288" w:lineRule="auto"/>
+        <w:ind/>
+        <w:jc w:val="center"/>
+        <w:rPr>
+          <w:rFonts w:ascii="Times New Roman" w:hAnsi="Times New Roman" w:eastAsia="Times New Roman" w:cs="Times New Roman"/>
+          <w:noProof w:val="0"/>
+          <w:color w:val="000000" w:themeColor="text1" w:themeTint="FF" w:themeShade="FF"/>
+          <w:sz w:val="24"/>
+          <w:szCs w:val="24"/>
+          <w:lang w:val="en-US"/>
+        </w:rPr>
+      </w:pPr>
+    </w:p>
+    <w:p>
+      <w:pPr>
+        <w:bidi w:val="0"/>
+        <w:spacing w:before="1200" w:beforeAutospacing="off" w:after="160" w:afterAutospacing="off" w:line="288" w:lineRule="auto"/>
+        <w:ind/>
+        <w:jc w:val="center"/>
+      </w:pPr>
+      <w:r>
+        <w:rPr>
+          <w:rFonts w:ascii="Times New Roman" w:hAnsi="Times New Roman" w:eastAsia="Times New Roman" w:cs="Times New Roman"/>
+          <w:noProof w:val="0"/>
+          <w:color w:val="000000" w:themeColor="text1" w:themeTint="FF" w:themeShade="FF"/>
+          <w:sz w:val="24"/>
+          <w:szCs w:val="24"/>
+          <w:lang w:val="en-US"/>
+        </w:rPr>
+        <w:t>Mata Kuliah Data Structures and Algorithm Analysis</w:t>
+      </w:r>
+    </w:p>
+    <w:p>
+      <w:pPr>
+        <w:bidi w:val="0"/>
+        <w:spacing w:before="0" w:beforeAutospacing="off" w:after="160" w:afterAutospacing="off" w:line="288" w:lineRule="auto"/>
+        <w:ind/>
+        <w:jc w:val="center"/>
+      </w:pPr>
+      <w:r>
+        <w:rPr>
+          <w:rFonts w:ascii="Times New Roman" w:hAnsi="Times New Roman" w:eastAsia="Times New Roman" w:cs="Times New Roman"/>
+          <w:noProof w:val="0"/>
+          <w:color w:val="000000" w:themeColor="text1" w:themeTint="FF" w:themeShade="FF"/>
+          <w:sz w:val="24"/>
+          <w:szCs w:val="24"/>
+          <w:lang w:val="en-US"/>
+        </w:rPr>
+        <w:t>Kelas LYCA-LEC</w:t>
+      </w:r>
+    </w:p>
+    <w:p>
+      <w:pPr>
+        <w:bidi w:val="0"/>
+        <w:spacing w:before="0" w:beforeAutospacing="off" w:after="160" w:afterAutospacing="off" w:line="288" w:lineRule="auto"/>
+        <w:ind/>
+        <w:jc w:val="center"/>
+      </w:pPr>
+      <w:r>
+        <w:rPr>
+          <w:rFonts w:ascii="Times New Roman" w:hAnsi="Times New Roman" w:eastAsia="Times New Roman" w:cs="Times New Roman"/>
+          <w:noProof w:val="0"/>
+          <w:color w:val="000000" w:themeColor="text1" w:themeTint="FF" w:themeShade="FF"/>
+          <w:sz w:val="24"/>
+          <w:szCs w:val="24"/>
+          <w:lang w:val="en-US"/>
+        </w:rPr>
+        <w:t>Week 8</w:t>
+      </w:r>
+    </w:p>
+    <w:p>
+      <w:pPr>
+        <w:pStyle w:val="Normal"/>
         <w:ind w:left="284"/>
         <w:jc w:val="both"/>
         <w:rPr>
@@ -3391,6 +3828,7 @@
     </w:p>
     <w:p>
       <w:pPr>
+        <w:pStyle w:val="Normal"/>
         <w:ind w:left="284"/>
         <w:jc w:val="both"/>
         <w:rPr>
@@ -3402,17 +3840,15 @@
     </w:p>
     <w:p>
       <w:pPr>
-        <w:ind w:left="284"/>
-        <w:jc w:val="both"/>
-        <w:rPr>
-          <w:rFonts w:ascii="Times New Roman" w:hAnsi="Times New Roman"/>
-          <w:sz w:val="24"/>
-          <w:szCs w:val="24"/>
-        </w:rPr>
-      </w:pPr>
+        <w:ind/>
+      </w:pPr>
+      <w:r>
+        <w:br w:type="page"/>
+      </w:r>
     </w:p>
     <w:p>
       <w:pPr>
+        <w:pStyle w:val="Normal"/>
         <w:ind w:left="284"/>
         <w:jc w:val="both"/>
       </w:pPr>
@@ -4667,7 +5103,7 @@
       </w:pPr>
       <w:r>
         <w:drawing>
-          <wp:inline wp14:editId="3B8499A2" wp14:anchorId="7E482904">
+          <wp:inline wp14:editId="37D61311" wp14:anchorId="7E482904">
             <wp:extent cx="5669280" cy="3100924"/>
             <wp:effectExtent l="0" t="0" r="0" b="0"/>
             <wp:docPr id="269059307" name="drawing"/>
@@ -6149,7 +6585,7 @@
           <w:szCs w:val="24"/>
           <w:lang w:val="en-US"/>
         </w:rPr>
-        <w:t>Tabel 1. Hasil Anggota 4 pada kode yang diserahkan kelompok.</w:t>
+        <w:t>Tabel 1. Hasil awal Anggota 4, sebelum koreksi satuan durasi.</w:t>
       </w:r>
     </w:p>
     <w:p>
@@ -6167,7 +6603,7 @@
           <w:szCs w:val="24"/>
           <w:lang w:val="en-US"/>
         </w:rPr>
-        <w:t>Uji ulang berikut dilakukan pada salinan yang telah disesuaikan agar cariDurasiTerpanjang mengembalikan double. Lingkungan pengujian: Windows, OpenJDK 21.0.10, 18-10-2026 21:24:11 WIB. Hasilnya tidak menggantikan tabel Anggota 4.</w:t>
+        <w:t>Uji ulang dilakukan setelah koreksi return type double dan konversi durasi M.SS menjadi menit riil. Lingkungan pengujian: Windows, OpenJDK 21.0.10, 19-10-2026 01:23:57 WIB. Hasilnya tidak menggantikan tabel Anggota 4.</w:t>
       </w:r>
     </w:p>
     <w:tbl>
@@ -6392,7 +6828,7 @@
                 <w:sz w:val="22"/>
                 <w:szCs w:val="22"/>
               </w:rPr>
-              <w:t>0.000127</w:t>
+              <w:t>0.000100</w:t>
             </w:r>
           </w:p>
         </w:tc>
@@ -6424,7 +6860,7 @@
                 <w:sz w:val="22"/>
                 <w:szCs w:val="22"/>
               </w:rPr>
-              <w:t>0.010360</w:t>
+              <w:t>0.033895</w:t>
             </w:r>
           </w:p>
         </w:tc>
@@ -6456,7 +6892,7 @@
                 <w:sz w:val="22"/>
                 <w:szCs w:val="22"/>
               </w:rPr>
-              <w:t>0.000302</w:t>
+              <w:t>0.000177</w:t>
             </w:r>
           </w:p>
         </w:tc>
@@ -6525,7 +6961,7 @@
                 <w:sz w:val="22"/>
                 <w:szCs w:val="22"/>
               </w:rPr>
-              <w:t>0.000063</w:t>
+              <w:t>0.000122</w:t>
             </w:r>
           </w:p>
         </w:tc>
@@ -6557,7 +6993,7 @@
                 <w:sz w:val="22"/>
                 <w:szCs w:val="22"/>
               </w:rPr>
-              <w:t>0.009449</w:t>
+              <w:t>0.041886</w:t>
             </w:r>
           </w:p>
         </w:tc>
@@ -6589,7 +7025,7 @@
                 <w:sz w:val="22"/>
                 <w:szCs w:val="22"/>
               </w:rPr>
-              <w:t>0.000187</w:t>
+              <w:t>0.000145</w:t>
             </w:r>
           </w:p>
         </w:tc>
@@ -6658,7 +7094,7 @@
                 <w:sz w:val="22"/>
                 <w:szCs w:val="22"/>
               </w:rPr>
-              <w:t>0.000064</w:t>
+              <w:t>0.000078</w:t>
             </w:r>
           </w:p>
         </w:tc>
@@ -6690,7 +7126,7 @@
                 <w:sz w:val="22"/>
                 <w:szCs w:val="22"/>
               </w:rPr>
-              <w:t>0.010626</w:t>
+              <w:t>0.047253</w:t>
             </w:r>
           </w:p>
         </w:tc>
@@ -6722,7 +7158,7 @@
                 <w:sz w:val="22"/>
                 <w:szCs w:val="22"/>
               </w:rPr>
-              <w:t>0.000123</w:t>
+              <w:t>0.000118</w:t>
             </w:r>
           </w:p>
         </w:tc>
@@ -6827,7 +7263,7 @@
           <w:szCs w:val="24"/>
           <w:lang w:val="en-US"/>
         </w:rPr>
-        <w:t>Program dikompilasi menggunakan javac -encoding UTF-8. Gambar berikut merupakan screenshot halaman dokumentasi lokal yang menampilkan keluaran proses Java aktual. Tampilan tersebut bukan IDE; teks keluaran berasal dari program yang dijalankan tanpa mengganti hasilnya.</w:t>
+        <w:t>Program dikompilasi menggunakan javac -encoding UTF-8. Gambar berikut menyajikan transkrip keluaran Java aktual dari uji ulang, bukan screenshot IDE. Berkas output_program.txt menyimpan keluaran lengkapnya.</w:t>
       </w:r>
     </w:p>
     <w:p>
@@ -6844,7 +7280,7 @@
           <w:szCs w:val="24"/>
           <w:lang w:val="en-US"/>
         </w:rPr>
-        <w:t>Pada 10 lagu, total durasi adalah 42,22 menit dan durasi terbesar 7,29 menit, yaitu IN THE NAME OF LOVE. Nilai durasi pada kode diperlakukan sebagai menit desimal, bukan format menit:detik.</w:t>
+        <w:t>Total 10 lagu adalah 44 menit 22 detik (44,37 menit riil). Durasi terpanjang adalah 7 menit 29 detik, yaitu IN THE NAME OF LOVE. Data awal memakai M.SS: 4.23 berarti 4 menit 23 detik, sesuai tugas sebelumnya. Constructor mengubahnya menjadi menit riil sebelum rekursi; keluaran memakai menit:detik.</w:t>
       </w:r>
     </w:p>
     <w:p>
@@ -6855,8 +7291,8 @@
       </w:pPr>
       <w:r>
         <w:drawing>
-          <wp:inline wp14:editId="4C3A940B" wp14:anchorId="5C89ED5D">
-            <wp:extent cx="6286500" cy="2228850"/>
+          <wp:inline wp14:editId="5ADA1AD6" wp14:anchorId="5C89ED5D">
+            <wp:extent cx="5669280" cy="1197262"/>
             <wp:effectExtent l="0" t="0" r="0" b="0"/>
             <wp:docPr id="1428024220" name="drawing"/>
             <wp:cNvGraphicFramePr>
@@ -6884,7 +7320,7 @@
                   <pic:spPr>
                     <a:xfrm>
                       <a:off x="0" y="0"/>
-                      <a:ext cx="6286500" cy="2228850"/>
+                      <a:ext cx="5669280" cy="1197262"/>
                     </a:xfrm>
                     <a:prstGeom prst="rect">
                       <a:avLst/>
@@ -6922,8 +7358,8 @@
       </w:pPr>
       <w:r>
         <w:drawing>
-          <wp:inline wp14:editId="4BCF412F" wp14:anchorId="3A51D84E">
-            <wp:extent cx="5669280" cy="2868999"/>
+          <wp:inline wp14:editId="670FEADB" wp14:anchorId="3A51D84E">
+            <wp:extent cx="5669280" cy="2070033"/>
             <wp:effectExtent l="0" t="0" r="0" b="0"/>
             <wp:docPr id="1785495388" name="drawing"/>
             <wp:cNvGraphicFramePr>
@@ -6951,7 +7387,7 @@
                   <pic:spPr>
                     <a:xfrm rot="0">
                       <a:off x="0" y="0"/>
-                      <a:ext cx="5669280" cy="2868999"/>
+                      <a:ext cx="5669280" cy="2070033"/>
                     </a:xfrm>
                     <a:prstGeom prst="rect">
                       <a:avLst/>
@@ -6992,6 +7428,7 @@
       <w:pPr>
         <w:pStyle w:val="Normal"/>
         <w:keepNext w:val="1"/>
+        <w:pageBreakBefore w:val="1"/>
       </w:pPr>
       <w:r>
         <w:rPr>
@@ -7060,7 +7497,7 @@
           <w:szCs w:val="24"/>
           <w:lang w:val="en-US"/>
         </w:rPr>
-        <w:t>Pengujian otomatis membandingkan total dan maksimum dengan perhitungan iteratif, lalu memeriksa jumlah baris dan urutan reverse traversal. Ukuran yang diuji adalah 0, 1, 2, 3, 4, 5, 6, 8, dan 10 lagu, ditambah kasus dua durasi sama. Seluruh 69 pemeriksaan lulus.</w:t>
+        <w:t>Pengujian membandingkan total dan maksimum dengan acuan detik yang dihitung terpisah, serta memeriksa urutan traversal. Ukuran yang diuji adalah 0, 1, 2, 3, 4, 5, 6, 8, dan 10 lagu. Kasus tambahan mencakup durasi sama, perpindahan 60 detik, nol di depan detik, dan masukan tidak valid. Seluruh 77 pemeriksaan lulus.</w:t>
       </w:r>
     </w:p>
     <w:p>
@@ -7071,8 +7508,8 @@
       </w:pPr>
       <w:r>
         <w:drawing>
-          <wp:inline wp14:editId="3089106F" wp14:anchorId="7557C96A">
-            <wp:extent cx="6286500" cy="2552700"/>
+          <wp:inline wp14:editId="084D9AAE" wp14:anchorId="7557C96A">
+            <wp:extent cx="5669280" cy="1488186"/>
             <wp:effectExtent l="0" t="0" r="0" b="0"/>
             <wp:docPr id="900030634" name="drawing"/>
             <wp:cNvGraphicFramePr>
@@ -7100,7 +7537,7 @@
                   <pic:spPr>
                     <a:xfrm>
                       <a:off x="0" y="0"/>
-                      <a:ext cx="6286500" cy="2552700"/>
+                      <a:ext cx="5669280" cy="1488186"/>
                     </a:xfrm>
                     <a:prstGeom prst="rect">
                       <a:avLst/>
@@ -7200,7 +7637,7 @@
           <w:szCs w:val="24"/>
           <w:lang w:val="en-US"/>
         </w:rPr>
-        <w:t>Salinan asli tersimpan pada source_asli. Perbaikan bertanda - khenaro menyesuaikan return type maksimum menjadi double, pemanggil di main, dan komentar parameter. Data lagu serta logika pengukuran Anggota 4 dipertahankan.</w:t>
+        <w:t>File asli kelompok disimpan terpisah secara lokal. Koreksi - khenaro mencakup return type double, pemanggil, komentar parameter, serta konversi durasi M.SS menjadi menit riil. Data lagu dan pola pengukuran Anggota 4 tetap dipertahankan.</w:t>
       </w:r>
     </w:p>
     <w:p>
@@ -7275,7 +7712,7 @@
         </w:rPr>
         <w:t xml:space="preserve">Oracle. </w:t>
       </w:r>
-      <w:hyperlink r:id="R309f7048ecfe446c">
+      <w:hyperlink r:id="Rc052c57d5a004d0c">
         <w:r>
           <w:rPr>
             <w:rStyle w:val="Hyperlink"/>
@@ -7338,7 +7775,7 @@
         </w:rPr>
         <w:t xml:space="preserve">Repository GitHub: </w:t>
       </w:r>
-      <w:hyperlink r:id="Rfea1f4ce82b44b59">
+      <w:hyperlink r:id="R619d09d6d08942f0">
         <w:r>
           <w:rPr>
             <w:rStyle w:val="Hyperlink"/>

</xml_diff>

<commit_message>
Sinkronkan laporan Word bersama, PDF, dan paket final
</commit_message>
<xml_diff>
--- a/Laporan_PlaylistRekursif_Kelompok5.docx
+++ b/Laporan_PlaylistRekursif_Kelompok5.docx
@@ -2383,7 +2383,7 @@
         <w:t>).</w:t>
       </w:r>
     </w:p>
-    <w:p xmlns:wp14="http://schemas.microsoft.com/office/word/2010/wordml" wp14:textId="77777777">
+    <w:p xmlns:wp14="http://schemas.microsoft.com/office/word/2010/wordml" wp14:textId="7955EBFD">
       <w:pPr>
         <w:numPr>
           <w:ilvl w:val="0"/>
@@ -2405,7 +2405,124 @@
           <w:szCs w:val="24"/>
           <w:lang w:val="en-ID" w:eastAsia="en-ID"/>
         </w:rPr>
-        <w:t>Bandingkan hasil waktu eksekusi dan buat tabel analisis di laporan:</w:t>
+        <w:t>Bandingkan</w:t>
+      </w:r>
+      <w:r>
+        <w:rPr>
+          <w:rFonts w:ascii="Times New Roman" w:hAnsi="Times New Roman" w:eastAsia="Times New Roman"/>
+          <w:sz w:val="24"/>
+          <w:szCs w:val="24"/>
+          <w:lang w:val="en-ID" w:eastAsia="en-ID"/>
+        </w:rPr>
+        <w:t xml:space="preserve"> </w:t>
+      </w:r>
+      <w:r>
+        <w:rPr>
+          <w:rFonts w:ascii="Times New Roman" w:hAnsi="Times New Roman" w:eastAsia="Times New Roman"/>
+          <w:sz w:val="24"/>
+          <w:szCs w:val="24"/>
+          <w:lang w:val="en-ID" w:eastAsia="en-ID"/>
+        </w:rPr>
+        <w:t>hasil</w:t>
+      </w:r>
+      <w:r>
+        <w:rPr>
+          <w:rFonts w:ascii="Times New Roman" w:hAnsi="Times New Roman" w:eastAsia="Times New Roman"/>
+          <w:sz w:val="24"/>
+          <w:szCs w:val="24"/>
+          <w:lang w:val="en-ID" w:eastAsia="en-ID"/>
+        </w:rPr>
+        <w:t xml:space="preserve"> </w:t>
+      </w:r>
+      <w:r>
+        <w:rPr>
+          <w:rFonts w:ascii="Times New Roman" w:hAnsi="Times New Roman" w:eastAsia="Times New Roman"/>
+          <w:sz w:val="24"/>
+          <w:szCs w:val="24"/>
+          <w:lang w:val="en-ID" w:eastAsia="en-ID"/>
+        </w:rPr>
+        <w:t>waktu</w:t>
+      </w:r>
+      <w:r>
+        <w:rPr>
+          <w:rFonts w:ascii="Times New Roman" w:hAnsi="Times New Roman" w:eastAsia="Times New Roman"/>
+          <w:sz w:val="24"/>
+          <w:szCs w:val="24"/>
+          <w:lang w:val="en-ID" w:eastAsia="en-ID"/>
+        </w:rPr>
+        <w:t xml:space="preserve"> </w:t>
+      </w:r>
+      <w:r>
+        <w:rPr>
+          <w:rFonts w:ascii="Times New Roman" w:hAnsi="Times New Roman" w:eastAsia="Times New Roman"/>
+          <w:sz w:val="24"/>
+          <w:szCs w:val="24"/>
+          <w:lang w:val="en-ID" w:eastAsia="en-ID"/>
+        </w:rPr>
+        <w:t>eksekusi</w:t>
+      </w:r>
+      <w:r>
+        <w:rPr>
+          <w:rFonts w:ascii="Times New Roman" w:hAnsi="Times New Roman" w:eastAsia="Times New Roman"/>
+          <w:sz w:val="24"/>
+          <w:szCs w:val="24"/>
+          <w:lang w:val="en-ID" w:eastAsia="en-ID"/>
+        </w:rPr>
+        <w:t xml:space="preserve"> dan buat </w:t>
+      </w:r>
+      <w:r>
+        <w:rPr>
+          <w:rFonts w:ascii="Times New Roman" w:hAnsi="Times New Roman" w:eastAsia="Times New Roman"/>
+          <w:sz w:val="24"/>
+          <w:szCs w:val="24"/>
+          <w:lang w:val="en-ID" w:eastAsia="en-ID"/>
+        </w:rPr>
+        <w:t>tabel</w:t>
+      </w:r>
+      <w:r>
+        <w:rPr>
+          <w:rFonts w:ascii="Times New Roman" w:hAnsi="Times New Roman" w:eastAsia="Times New Roman"/>
+          <w:sz w:val="24"/>
+          <w:szCs w:val="24"/>
+          <w:lang w:val="en-ID" w:eastAsia="en-ID"/>
+        </w:rPr>
+        <w:t xml:space="preserve"> </w:t>
+      </w:r>
+      <w:r>
+        <w:rPr>
+          <w:rFonts w:ascii="Times New Roman" w:hAnsi="Times New Roman" w:eastAsia="Times New Roman"/>
+          <w:sz w:val="24"/>
+          <w:szCs w:val="24"/>
+          <w:lang w:val="en-ID" w:eastAsia="en-ID"/>
+        </w:rPr>
+        <w:t>analisis</w:t>
+      </w:r>
+      <w:r>
+        <w:rPr>
+          <w:rFonts w:ascii="Times New Roman" w:hAnsi="Times New Roman" w:eastAsia="Times New Roman"/>
+          <w:sz w:val="24"/>
+          <w:szCs w:val="24"/>
+          <w:lang w:val="en-ID" w:eastAsia="en-ID"/>
+        </w:rPr>
+        <w:t xml:space="preserve"> di </w:t>
+      </w:r>
+      <w:r>
+        <w:rPr>
+          <w:rFonts w:ascii="Times New Roman" w:hAnsi="Times New Roman" w:eastAsia="Times New Roman"/>
+          <w:sz w:val="24"/>
+          <w:szCs w:val="24"/>
+          <w:lang w:val="en-ID" w:eastAsia="en-ID"/>
+        </w:rPr>
+        <w:t>laporan</w:t>
+      </w:r>
+      <w:r>
+        <w:rPr>
+          <w:rFonts w:ascii="Times New Roman" w:hAnsi="Times New Roman" w:eastAsia="Times New Roman"/>
+          <w:sz w:val="24"/>
+          <w:szCs w:val="24"/>
+          <w:lang w:val="en-ID" w:eastAsia="en-ID"/>
+        </w:rPr>
+        <w:t>:</w:t>
       </w:r>
     </w:p>
     <w:p xmlns:wp14="http://schemas.microsoft.com/office/word/2010/wordml" wp14:textId="77777777">
@@ -2991,36 +3108,32 @@
         <w:t>Output program tampil jelas dan mudah dibaca.</w:t>
       </w:r>
     </w:p>
-    <w:p xmlns:wp14="http://schemas.microsoft.com/office/word/2010/wordml" wp14:textId="77777777">
-      <w:pPr>
+    <w:p xmlns:wp14="http://schemas.microsoft.com/office/word/2010/wordml" wp14:textId="5F7753B7">
+      <w:pPr>
+        <w:pStyle w:val="Normal"/>
         <w:ind w:left="284"/>
         <w:jc w:val="both"/>
         <w:rPr>
           <w:rFonts w:ascii="Times New Roman" w:hAnsi="Times New Roman"/>
-          <w:bCs/>
-          <w:sz w:val="24"/>
-          <w:szCs w:val="24"/>
-        </w:rPr>
-      </w:pPr>
-    </w:p>
-    <w:p xmlns:wp14="http://schemas.microsoft.com/office/word/2010/wordml" wp14:textId="77777777">
-      <w:pPr>
-        <w:jc w:val="both"/>
+          <w:sz w:val="24"/>
+          <w:szCs w:val="24"/>
+        </w:rPr>
+      </w:pPr>
+      <w:r>
         <w:rPr>
           <w:rFonts w:ascii="Times New Roman" w:hAnsi="Times New Roman"/>
-          <w:bCs/>
-          <w:sz w:val="24"/>
-          <w:szCs w:val="24"/>
-        </w:rPr>
-      </w:pPr>
+          <w:sz w:val="24"/>
+          <w:szCs w:val="24"/>
+        </w:rPr>
+        <w:t xml:space="preserve">Output yang </w:t>
+      </w:r>
       <w:r>
         <w:rPr>
           <w:rFonts w:ascii="Times New Roman" w:hAnsi="Times New Roman"/>
-          <w:bCs/>
-          <w:sz w:val="24"/>
-          <w:szCs w:val="24"/>
-        </w:rPr>
-        <w:t>Output yang diharapkan</w:t>
+          <w:sz w:val="24"/>
+          <w:szCs w:val="24"/>
+        </w:rPr>
+        <w:t>diharapkan</w:t>
       </w:r>
     </w:p>
     <w:tbl>
@@ -3044,14 +3157,16 @@
         <w:tc>
           <w:tcPr>
             <w:tcW w:w="7797" w:type="dxa"/>
+            <w:tcMar/>
           </w:tcPr>
           <w:p wp14:textId="77777777">
             <w:pPr>
-              <w:spacing w:after="0" w:line="360" w:lineRule="auto"/>
+              <w:spacing w:after="0" w:line="240" w:lineRule="auto"/>
               <w:jc w:val="both"/>
               <w:rPr>
                 <w:rFonts w:ascii="Courier New" w:hAnsi="Courier New" w:cs="Courier New"/>
-                <w:i/>
+                <w:i w:val="1"/>
+                <w:iCs w:val="1"/>
                 <w:sz w:val="20"/>
                 <w:szCs w:val="20"/>
               </w:rPr>
@@ -3059,7 +3174,8 @@
             <w:r>
               <w:rPr>
                 <w:rFonts w:ascii="Courier New" w:hAnsi="Courier New" w:cs="Courier New"/>
-                <w:i/>
+                <w:i w:val="1"/>
+                <w:iCs w:val="1"/>
                 <w:sz w:val="20"/>
                 <w:szCs w:val="20"/>
               </w:rPr>
@@ -3068,11 +3184,12 @@
           </w:p>
           <w:p wp14:textId="77777777">
             <w:pPr>
-              <w:spacing w:after="0" w:line="360" w:lineRule="auto"/>
+              <w:spacing w:after="0" w:line="240" w:lineRule="auto"/>
               <w:jc w:val="both"/>
               <w:rPr>
                 <w:rFonts w:ascii="Courier New" w:hAnsi="Courier New" w:cs="Courier New"/>
-                <w:i/>
+                <w:i w:val="1"/>
+                <w:iCs w:val="1"/>
                 <w:sz w:val="20"/>
                 <w:szCs w:val="20"/>
               </w:rPr>
@@ -3080,7 +3197,8 @@
             <w:r>
               <w:rPr>
                 <w:rFonts w:ascii="Courier New" w:hAnsi="Courier New" w:cs="Courier New"/>
-                <w:i/>
+                <w:i w:val="1"/>
+                <w:iCs w:val="1"/>
                 <w:sz w:val="20"/>
                 <w:szCs w:val="20"/>
               </w:rPr>
@@ -3089,11 +3207,12 @@
           </w:p>
           <w:p wp14:textId="77777777">
             <w:pPr>
-              <w:spacing w:after="0" w:line="360" w:lineRule="auto"/>
+              <w:spacing w:after="0" w:line="240" w:lineRule="auto"/>
               <w:jc w:val="both"/>
               <w:rPr>
                 <w:rFonts w:ascii="Courier New" w:hAnsi="Courier New" w:cs="Courier New"/>
-                <w:i/>
+                <w:i w:val="1"/>
+                <w:iCs w:val="1"/>
                 <w:sz w:val="20"/>
                 <w:szCs w:val="20"/>
               </w:rPr>
@@ -3101,7 +3220,8 @@
             <w:r>
               <w:rPr>
                 <w:rFonts w:ascii="Courier New" w:hAnsi="Courier New" w:cs="Courier New"/>
-                <w:i/>
+                <w:i w:val="1"/>
+                <w:iCs w:val="1"/>
                 <w:sz w:val="20"/>
                 <w:szCs w:val="20"/>
               </w:rPr>
@@ -3110,11 +3230,12 @@
           </w:p>
           <w:p wp14:textId="77777777">
             <w:pPr>
-              <w:spacing w:after="0" w:line="360" w:lineRule="auto"/>
+              <w:spacing w:after="0" w:line="240" w:lineRule="auto"/>
               <w:jc w:val="both"/>
               <w:rPr>
                 <w:rFonts w:ascii="Courier New" w:hAnsi="Courier New" w:cs="Courier New"/>
-                <w:i/>
+                <w:i w:val="1"/>
+                <w:iCs w:val="1"/>
                 <w:sz w:val="20"/>
                 <w:szCs w:val="20"/>
               </w:rPr>
@@ -3122,7 +3243,8 @@
             <w:r>
               <w:rPr>
                 <w:rFonts w:ascii="Courier New" w:hAnsi="Courier New" w:cs="Courier New"/>
-                <w:i/>
+                <w:i w:val="1"/>
+                <w:iCs w:val="1"/>
                 <w:sz w:val="20"/>
                 <w:szCs w:val="20"/>
               </w:rPr>
@@ -3131,11 +3253,12 @@
           </w:p>
           <w:p wp14:textId="77777777">
             <w:pPr>
-              <w:spacing w:after="0" w:line="360" w:lineRule="auto"/>
+              <w:spacing w:after="0" w:line="240" w:lineRule="auto"/>
               <w:jc w:val="both"/>
               <w:rPr>
                 <w:rFonts w:ascii="Courier New" w:hAnsi="Courier New" w:cs="Courier New"/>
-                <w:i/>
+                <w:i w:val="1"/>
+                <w:iCs w:val="1"/>
                 <w:sz w:val="20"/>
                 <w:szCs w:val="20"/>
               </w:rPr>
@@ -3143,11 +3266,12 @@
           </w:p>
           <w:p wp14:textId="77777777">
             <w:pPr>
-              <w:spacing w:after="0" w:line="360" w:lineRule="auto"/>
+              <w:spacing w:after="0" w:line="240" w:lineRule="auto"/>
               <w:jc w:val="both"/>
               <w:rPr>
                 <w:rFonts w:ascii="Courier New" w:hAnsi="Courier New" w:cs="Courier New"/>
-                <w:i/>
+                <w:i w:val="1"/>
+                <w:iCs w:val="1"/>
                 <w:sz w:val="20"/>
                 <w:szCs w:val="20"/>
               </w:rPr>
@@ -3155,7 +3279,8 @@
             <w:r>
               <w:rPr>
                 <w:rFonts w:ascii="Courier New" w:hAnsi="Courier New" w:cs="Courier New"/>
-                <w:i/>
+                <w:i w:val="1"/>
+                <w:iCs w:val="1"/>
                 <w:sz w:val="20"/>
                 <w:szCs w:val="20"/>
               </w:rPr>
@@ -3164,11 +3289,12 @@
           </w:p>
           <w:p wp14:textId="77777777">
             <w:pPr>
-              <w:spacing w:after="0" w:line="360" w:lineRule="auto"/>
+              <w:spacing w:after="0" w:line="240" w:lineRule="auto"/>
               <w:jc w:val="both"/>
               <w:rPr>
                 <w:rFonts w:ascii="Courier New" w:hAnsi="Courier New" w:cs="Courier New"/>
-                <w:i/>
+                <w:i w:val="1"/>
+                <w:iCs w:val="1"/>
                 <w:sz w:val="20"/>
                 <w:szCs w:val="20"/>
               </w:rPr>
@@ -3176,7 +3302,8 @@
             <w:r>
               <w:rPr>
                 <w:rFonts w:ascii="Courier New" w:hAnsi="Courier New" w:cs="Courier New"/>
-                <w:i/>
+                <w:i w:val="1"/>
+                <w:iCs w:val="1"/>
                 <w:sz w:val="20"/>
                 <w:szCs w:val="20"/>
               </w:rPr>
@@ -3185,11 +3312,12 @@
           </w:p>
           <w:p wp14:textId="77777777">
             <w:pPr>
-              <w:spacing w:after="0" w:line="360" w:lineRule="auto"/>
+              <w:spacing w:after="0" w:line="240" w:lineRule="auto"/>
               <w:jc w:val="both"/>
               <w:rPr>
                 <w:rFonts w:ascii="Courier New" w:hAnsi="Courier New" w:cs="Courier New"/>
-                <w:i/>
+                <w:i w:val="1"/>
+                <w:iCs w:val="1"/>
                 <w:sz w:val="20"/>
                 <w:szCs w:val="20"/>
               </w:rPr>
@@ -3197,7 +3325,8 @@
             <w:r>
               <w:rPr>
                 <w:rFonts w:ascii="Courier New" w:hAnsi="Courier New" w:cs="Courier New"/>
-                <w:i/>
+                <w:i w:val="1"/>
+                <w:iCs w:val="1"/>
                 <w:sz w:val="20"/>
                 <w:szCs w:val="20"/>
               </w:rPr>
@@ -3206,11 +3335,12 @@
           </w:p>
           <w:p wp14:textId="77777777">
             <w:pPr>
-              <w:spacing w:after="0" w:line="360" w:lineRule="auto"/>
+              <w:spacing w:after="0" w:line="240" w:lineRule="auto"/>
               <w:jc w:val="both"/>
               <w:rPr>
                 <w:rFonts w:ascii="Courier New" w:hAnsi="Courier New" w:cs="Courier New"/>
-                <w:i/>
+                <w:i w:val="1"/>
+                <w:iCs w:val="1"/>
                 <w:sz w:val="20"/>
                 <w:szCs w:val="20"/>
               </w:rPr>
@@ -3218,7 +3348,8 @@
             <w:r>
               <w:rPr>
                 <w:rFonts w:ascii="Courier New" w:hAnsi="Courier New" w:cs="Courier New"/>
-                <w:i/>
+                <w:i w:val="1"/>
+                <w:iCs w:val="1"/>
                 <w:sz w:val="20"/>
                 <w:szCs w:val="20"/>
               </w:rPr>
@@ -3227,11 +3358,12 @@
           </w:p>
           <w:p wp14:textId="77777777">
             <w:pPr>
-              <w:spacing w:after="0" w:line="360" w:lineRule="auto"/>
+              <w:spacing w:after="0" w:line="240" w:lineRule="auto"/>
               <w:jc w:val="both"/>
               <w:rPr>
                 <w:rFonts w:ascii="Courier New" w:hAnsi="Courier New" w:cs="Courier New"/>
-                <w:i/>
+                <w:i w:val="1"/>
+                <w:iCs w:val="1"/>
                 <w:sz w:val="20"/>
                 <w:szCs w:val="20"/>
               </w:rPr>
@@ -3239,7 +3371,8 @@
             <w:r>
               <w:rPr>
                 <w:rFonts w:ascii="Courier New" w:hAnsi="Courier New" w:cs="Courier New"/>
-                <w:i/>
+                <w:i w:val="1"/>
+                <w:iCs w:val="1"/>
                 <w:sz w:val="20"/>
                 <w:szCs w:val="20"/>
               </w:rPr>
@@ -3248,11 +3381,12 @@
           </w:p>
           <w:p wp14:textId="77777777">
             <w:pPr>
-              <w:spacing w:after="0" w:line="360" w:lineRule="auto"/>
+              <w:spacing w:after="0" w:line="240" w:lineRule="auto"/>
               <w:jc w:val="both"/>
               <w:rPr>
                 <w:rFonts w:ascii="Courier New" w:hAnsi="Courier New" w:cs="Courier New"/>
-                <w:i/>
+                <w:i w:val="1"/>
+                <w:iCs w:val="1"/>
                 <w:sz w:val="20"/>
                 <w:szCs w:val="20"/>
               </w:rPr>
@@ -3260,7 +3394,8 @@
             <w:r>
               <w:rPr>
                 <w:rFonts w:ascii="Courier New" w:hAnsi="Courier New" w:cs="Courier New"/>
-                <w:i/>
+                <w:i w:val="1"/>
+                <w:iCs w:val="1"/>
                 <w:sz w:val="20"/>
                 <w:szCs w:val="20"/>
               </w:rPr>
@@ -3269,11 +3404,12 @@
           </w:p>
           <w:p wp14:textId="77777777">
             <w:pPr>
-              <w:spacing w:after="0" w:line="360" w:lineRule="auto"/>
+              <w:spacing w:after="0" w:line="240" w:lineRule="auto"/>
               <w:jc w:val="both"/>
               <w:rPr>
                 <w:rFonts w:ascii="Courier New" w:hAnsi="Courier New" w:cs="Courier New"/>
-                <w:i/>
+                <w:i w:val="1"/>
+                <w:iCs w:val="1"/>
                 <w:sz w:val="20"/>
                 <w:szCs w:val="20"/>
               </w:rPr>
@@ -3281,11 +3417,12 @@
           </w:p>
           <w:p wp14:textId="77777777">
             <w:pPr>
-              <w:spacing w:after="0" w:line="360" w:lineRule="auto"/>
+              <w:spacing w:after="0" w:line="240" w:lineRule="auto"/>
               <w:jc w:val="both"/>
               <w:rPr>
                 <w:rFonts w:ascii="Courier New" w:hAnsi="Courier New" w:cs="Courier New"/>
-                <w:i/>
+                <w:i w:val="1"/>
+                <w:iCs w:val="1"/>
                 <w:sz w:val="20"/>
                 <w:szCs w:val="20"/>
               </w:rPr>
@@ -3293,7 +3430,8 @@
             <w:r>
               <w:rPr>
                 <w:rFonts w:ascii="Courier New" w:hAnsi="Courier New" w:cs="Courier New"/>
-                <w:i/>
+                <w:i w:val="1"/>
+                <w:iCs w:val="1"/>
                 <w:sz w:val="20"/>
                 <w:szCs w:val="20"/>
               </w:rPr>
@@ -3302,11 +3440,12 @@
           </w:p>
           <w:p wp14:textId="77777777">
             <w:pPr>
-              <w:spacing w:after="0" w:line="360" w:lineRule="auto"/>
+              <w:spacing w:after="0" w:line="240" w:lineRule="auto"/>
               <w:jc w:val="both"/>
               <w:rPr>
                 <w:rFonts w:ascii="Courier New" w:hAnsi="Courier New" w:cs="Courier New"/>
-                <w:i/>
+                <w:i w:val="1"/>
+                <w:iCs w:val="1"/>
                 <w:sz w:val="20"/>
                 <w:szCs w:val="20"/>
               </w:rPr>
@@ -3314,7 +3453,8 @@
             <w:r>
               <w:rPr>
                 <w:rFonts w:ascii="Courier New" w:hAnsi="Courier New" w:cs="Courier New"/>
-                <w:i/>
+                <w:i w:val="1"/>
+                <w:iCs w:val="1"/>
                 <w:sz w:val="20"/>
                 <w:szCs w:val="20"/>
               </w:rPr>
@@ -3323,11 +3463,12 @@
           </w:p>
           <w:p wp14:textId="77777777">
             <w:pPr>
-              <w:spacing w:after="0" w:line="360" w:lineRule="auto"/>
+              <w:spacing w:after="0" w:line="240" w:lineRule="auto"/>
               <w:jc w:val="both"/>
               <w:rPr>
                 <w:rFonts w:ascii="Courier New" w:hAnsi="Courier New" w:cs="Courier New"/>
-                <w:i/>
+                <w:i w:val="1"/>
+                <w:iCs w:val="1"/>
                 <w:sz w:val="20"/>
                 <w:szCs w:val="20"/>
               </w:rPr>
@@ -3335,7 +3476,8 @@
             <w:r>
               <w:rPr>
                 <w:rFonts w:ascii="Courier New" w:hAnsi="Courier New" w:cs="Courier New"/>
-                <w:i/>
+                <w:i w:val="1"/>
+                <w:iCs w:val="1"/>
                 <w:sz w:val="20"/>
                 <w:szCs w:val="20"/>
               </w:rPr>
@@ -3347,10 +3489,10 @@
     </w:tbl>
     <w:p>
       <w:pPr>
-        <w:spacing w:before="240" w:beforeAutospacing="off" w:after="280" w:afterAutospacing="off" w:line="288" w:lineRule="auto"/>
-        <w:ind/>
+        <w:pStyle w:val="Normal"/>
+        <w:keepNext w:val="1"/>
+        <w:pageBreakBefore w:val="1"/>
         <w:jc w:val="center"/>
-        <w:pageBreakBefore w:val="1"/>
       </w:pPr>
       <w:r>
         <w:rPr>
@@ -3369,7 +3511,6 @@
     <w:p>
       <w:pPr>
         <w:spacing w:before="0" w:beforeAutospacing="off" w:after="1920" w:afterAutospacing="off" w:line="288" w:lineRule="auto"/>
-        <w:ind/>
         <w:jc w:val="center"/>
       </w:pPr>
       <w:r>
@@ -3389,7 +3530,6 @@
     <w:p>
       <w:pPr>
         <w:spacing w:before="0" w:beforeAutospacing="off" w:after="200" w:afterAutospacing="off" w:line="288" w:lineRule="auto"/>
-        <w:ind/>
         <w:jc w:val="center"/>
       </w:pPr>
       <w:r>
@@ -3409,7 +3549,6 @@
     <w:p>
       <w:pPr>
         <w:spacing w:before="0" w:beforeAutospacing="off" w:after="280" w:afterAutospacing="off" w:line="288" w:lineRule="auto"/>
-        <w:ind/>
         <w:jc w:val="center"/>
       </w:pPr>
       <w:r>
@@ -3745,7 +3884,6 @@
       <w:pPr>
         <w:bidi w:val="0"/>
         <w:spacing w:before="1200" w:beforeAutospacing="off" w:after="160" w:afterAutospacing="off" w:line="288" w:lineRule="auto"/>
-        <w:ind/>
         <w:jc w:val="center"/>
         <w:rPr>
           <w:rFonts w:ascii="Times New Roman" w:hAnsi="Times New Roman" w:eastAsia="Times New Roman" w:cs="Times New Roman"/>
@@ -3761,7 +3899,6 @@
       <w:pPr>
         <w:bidi w:val="0"/>
         <w:spacing w:before="1200" w:beforeAutospacing="off" w:after="160" w:afterAutospacing="off" w:line="288" w:lineRule="auto"/>
-        <w:ind/>
         <w:jc w:val="center"/>
       </w:pPr>
       <w:r>
@@ -3780,7 +3917,6 @@
       <w:pPr>
         <w:bidi w:val="0"/>
         <w:spacing w:before="0" w:beforeAutospacing="off" w:after="160" w:afterAutospacing="off" w:line="288" w:lineRule="auto"/>
-        <w:ind/>
         <w:jc w:val="center"/>
       </w:pPr>
       <w:r>
@@ -3799,7 +3935,6 @@
       <w:pPr>
         <w:bidi w:val="0"/>
         <w:spacing w:before="0" w:beforeAutospacing="off" w:after="160" w:afterAutospacing="off" w:line="288" w:lineRule="auto"/>
-        <w:ind/>
         <w:jc w:val="center"/>
       </w:pPr>
       <w:r>
@@ -3839,9 +3974,6 @@
       </w:pPr>
     </w:p>
     <w:p>
-      <w:pPr>
-        <w:ind/>
-      </w:pPr>
       <w:r>
         <w:br w:type="page"/>
       </w:r>
@@ -3865,7 +3997,7 @@
       <w:pPr>
         <w:pStyle w:val="Normal"/>
         <w:ind w:left="284"/>
-        <w:jc w:val="both"/>
+        <w:jc w:val="left"/>
       </w:pPr>
       <w:r>
         <w:rPr>
@@ -3912,7 +4044,7 @@
       </w:r>
       <w:r>
         <w:drawing>
-          <wp:inline wp14:editId="5630A349" wp14:anchorId="4F26BF7F">
+          <wp:inline wp14:editId="02E91707" wp14:anchorId="4F26BF7F">
             <wp:extent cx="6286500" cy="1476375"/>
             <wp:effectExtent l="0" t="0" r="0" b="0"/>
             <wp:docPr id="190334040" name="drawing"/>
@@ -4854,19 +4986,21 @@
     </w:p>
     <w:p>
       <w:pPr>
-        <w:spacing w:before="0" w:beforeAutospacing="off" w:after="120" w:afterAutospacing="off" w:line="276" w:lineRule="auto"/>
-        <w:jc w:val="both"/>
-      </w:pPr>
-      <w:r>
-        <w:rPr>
-          <w:rFonts w:ascii="Times New Roman" w:hAnsi="Times New Roman" w:eastAsia="Times New Roman" w:cs="Times New Roman"/>
-          <w:noProof w:val="0"/>
-          <w:color w:val="000000" w:themeColor="text1" w:themeTint="FF" w:themeShade="FF"/>
-          <w:sz w:val="24"/>
-          <w:szCs w:val="24"/>
-          <w:lang w:val="en-US"/>
-        </w:rPr>
-        <w:t>Anggota 5: Khenaro Daffa Asyrof | NIM 2902824590 | Kelompok 5 | LYCA-LEC</w:t>
+        <w:spacing w:before="200" w:beforeAutospacing="off" w:after="120" w:afterAutospacing="off" w:line="276" w:lineRule="auto"/>
+        <w:jc w:val="left"/>
+      </w:pPr>
+      <w:r>
+        <w:rPr>
+          <w:rFonts w:ascii="Times New Roman" w:hAnsi="Times New Roman" w:eastAsia="Times New Roman" w:cs="Times New Roman"/>
+          <w:b w:val="1"/>
+          <w:bCs w:val="1"/>
+          <w:noProof w:val="0"/>
+          <w:color w:val="000000" w:themeColor="text1" w:themeTint="FF" w:themeShade="FF"/>
+          <w:sz w:val="24"/>
+          <w:szCs w:val="24"/>
+          <w:lang w:val="en-US"/>
+        </w:rPr>
+        <w:t xml:space="preserve">Anggota 5: Khenaro Daffa Asyrof | NIM 2902824590 | Kelompok 5 | LYCA-LEC </w:t>
       </w:r>
     </w:p>
     <w:p>
@@ -5103,7 +5237,7 @@
       </w:pPr>
       <w:r>
         <w:drawing>
-          <wp:inline wp14:editId="37D61311" wp14:anchorId="7E482904">
+          <wp:inline wp14:editId="30EC9333" wp14:anchorId="7E482904">
             <wp:extent cx="5669280" cy="3100924"/>
             <wp:effectExtent l="0" t="0" r="0" b="0"/>
             <wp:docPr id="269059307" name="drawing"/>
@@ -6603,7 +6737,414 @@
           <w:szCs w:val="24"/>
           <w:lang w:val="en-US"/>
         </w:rPr>
-        <w:t>Uji ulang dilakukan setelah koreksi return type double dan konversi durasi M.SS menjadi menit riil. Lingkungan pengujian: Windows, OpenJDK 21.0.10, 19-10-2026 01:23:57 WIB. Hasilnya tidak menggantikan tabel Anggota 4.</w:t>
+        <w:t xml:space="preserve">Uji </w:t>
+      </w:r>
+      <w:r>
+        <w:rPr>
+          <w:rFonts w:ascii="Times New Roman" w:hAnsi="Times New Roman" w:eastAsia="Times New Roman" w:cs="Times New Roman"/>
+          <w:noProof w:val="0"/>
+          <w:color w:val="000000" w:themeColor="text1" w:themeTint="FF" w:themeShade="FF"/>
+          <w:sz w:val="24"/>
+          <w:szCs w:val="24"/>
+          <w:lang w:val="en-US"/>
+        </w:rPr>
+        <w:t>ulang</w:t>
+      </w:r>
+      <w:r>
+        <w:rPr>
+          <w:rFonts w:ascii="Times New Roman" w:hAnsi="Times New Roman" w:eastAsia="Times New Roman" w:cs="Times New Roman"/>
+          <w:noProof w:val="0"/>
+          <w:color w:val="000000" w:themeColor="text1" w:themeTint="FF" w:themeShade="FF"/>
+          <w:sz w:val="24"/>
+          <w:szCs w:val="24"/>
+          <w:lang w:val="en-US"/>
+        </w:rPr>
+        <w:t xml:space="preserve"> </w:t>
+      </w:r>
+      <w:r>
+        <w:rPr>
+          <w:rFonts w:ascii="Times New Roman" w:hAnsi="Times New Roman" w:eastAsia="Times New Roman" w:cs="Times New Roman"/>
+          <w:noProof w:val="0"/>
+          <w:color w:val="000000" w:themeColor="text1" w:themeTint="FF" w:themeShade="FF"/>
+          <w:sz w:val="24"/>
+          <w:szCs w:val="24"/>
+          <w:lang w:val="en-US"/>
+        </w:rPr>
+        <w:t>dilakukan</w:t>
+      </w:r>
+      <w:r>
+        <w:rPr>
+          <w:rFonts w:ascii="Times New Roman" w:hAnsi="Times New Roman" w:eastAsia="Times New Roman" w:cs="Times New Roman"/>
+          <w:noProof w:val="0"/>
+          <w:color w:val="000000" w:themeColor="text1" w:themeTint="FF" w:themeShade="FF"/>
+          <w:sz w:val="24"/>
+          <w:szCs w:val="24"/>
+          <w:lang w:val="en-US"/>
+        </w:rPr>
+        <w:t xml:space="preserve"> </w:t>
+      </w:r>
+      <w:r>
+        <w:rPr>
+          <w:rFonts w:ascii="Times New Roman" w:hAnsi="Times New Roman" w:eastAsia="Times New Roman" w:cs="Times New Roman"/>
+          <w:noProof w:val="0"/>
+          <w:color w:val="000000" w:themeColor="text1" w:themeTint="FF" w:themeShade="FF"/>
+          <w:sz w:val="24"/>
+          <w:szCs w:val="24"/>
+          <w:lang w:val="en-US"/>
+        </w:rPr>
+        <w:t>setelah</w:t>
+      </w:r>
+      <w:r>
+        <w:rPr>
+          <w:rFonts w:ascii="Times New Roman" w:hAnsi="Times New Roman" w:eastAsia="Times New Roman" w:cs="Times New Roman"/>
+          <w:noProof w:val="0"/>
+          <w:color w:val="000000" w:themeColor="text1" w:themeTint="FF" w:themeShade="FF"/>
+          <w:sz w:val="24"/>
+          <w:szCs w:val="24"/>
+          <w:lang w:val="en-US"/>
+        </w:rPr>
+        <w:t xml:space="preserve"> </w:t>
+      </w:r>
+      <w:r>
+        <w:rPr>
+          <w:rFonts w:ascii="Times New Roman" w:hAnsi="Times New Roman" w:eastAsia="Times New Roman" w:cs="Times New Roman"/>
+          <w:noProof w:val="0"/>
+          <w:color w:val="000000" w:themeColor="text1" w:themeTint="FF" w:themeShade="FF"/>
+          <w:sz w:val="24"/>
+          <w:szCs w:val="24"/>
+          <w:lang w:val="en-US"/>
+        </w:rPr>
+        <w:t>koreksi</w:t>
+      </w:r>
+      <w:r>
+        <w:rPr>
+          <w:rFonts w:ascii="Times New Roman" w:hAnsi="Times New Roman" w:eastAsia="Times New Roman" w:cs="Times New Roman"/>
+          <w:noProof w:val="0"/>
+          <w:color w:val="000000" w:themeColor="text1" w:themeTint="FF" w:themeShade="FF"/>
+          <w:sz w:val="24"/>
+          <w:szCs w:val="24"/>
+          <w:lang w:val="en-US"/>
+        </w:rPr>
+        <w:t xml:space="preserve"> return type double dan </w:t>
+      </w:r>
+      <w:r>
+        <w:rPr>
+          <w:rFonts w:ascii="Times New Roman" w:hAnsi="Times New Roman" w:eastAsia="Times New Roman" w:cs="Times New Roman"/>
+          <w:noProof w:val="0"/>
+          <w:color w:val="000000" w:themeColor="text1" w:themeTint="FF" w:themeShade="FF"/>
+          <w:sz w:val="24"/>
+          <w:szCs w:val="24"/>
+          <w:lang w:val="en-US"/>
+        </w:rPr>
+        <w:t>konversi</w:t>
+      </w:r>
+      <w:r>
+        <w:rPr>
+          <w:rFonts w:ascii="Times New Roman" w:hAnsi="Times New Roman" w:eastAsia="Times New Roman" w:cs="Times New Roman"/>
+          <w:noProof w:val="0"/>
+          <w:color w:val="000000" w:themeColor="text1" w:themeTint="FF" w:themeShade="FF"/>
+          <w:sz w:val="24"/>
+          <w:szCs w:val="24"/>
+          <w:lang w:val="en-US"/>
+        </w:rPr>
+        <w:t xml:space="preserve"> </w:t>
+      </w:r>
+      <w:r>
+        <w:rPr>
+          <w:rFonts w:ascii="Times New Roman" w:hAnsi="Times New Roman" w:eastAsia="Times New Roman" w:cs="Times New Roman"/>
+          <w:noProof w:val="0"/>
+          <w:color w:val="000000" w:themeColor="text1" w:themeTint="FF" w:themeShade="FF"/>
+          <w:sz w:val="24"/>
+          <w:szCs w:val="24"/>
+          <w:lang w:val="en-US"/>
+        </w:rPr>
+        <w:t>durasi</w:t>
+      </w:r>
+      <w:r>
+        <w:rPr>
+          <w:rFonts w:ascii="Times New Roman" w:hAnsi="Times New Roman" w:eastAsia="Times New Roman" w:cs="Times New Roman"/>
+          <w:noProof w:val="0"/>
+          <w:color w:val="000000" w:themeColor="text1" w:themeTint="FF" w:themeShade="FF"/>
+          <w:sz w:val="24"/>
+          <w:szCs w:val="24"/>
+          <w:lang w:val="en-US"/>
+        </w:rPr>
+        <w:t xml:space="preserve"> </w:t>
+      </w:r>
+      <w:r>
+        <w:rPr>
+          <w:rFonts w:ascii="Times New Roman" w:hAnsi="Times New Roman" w:eastAsia="Times New Roman" w:cs="Times New Roman"/>
+          <w:noProof w:val="0"/>
+          <w:color w:val="000000" w:themeColor="text1" w:themeTint="FF" w:themeShade="FF"/>
+          <w:sz w:val="24"/>
+          <w:szCs w:val="24"/>
+          <w:lang w:val="en-US"/>
+        </w:rPr>
+        <w:t>M.SS</w:t>
+      </w:r>
+      <w:r>
+        <w:rPr>
+          <w:rFonts w:ascii="Times New Roman" w:hAnsi="Times New Roman" w:eastAsia="Times New Roman" w:cs="Times New Roman"/>
+          <w:noProof w:val="0"/>
+          <w:color w:val="000000" w:themeColor="text1" w:themeTint="FF" w:themeShade="FF"/>
+          <w:sz w:val="24"/>
+          <w:szCs w:val="24"/>
+          <w:lang w:val="en-US"/>
+        </w:rPr>
+        <w:t xml:space="preserve"> </w:t>
+      </w:r>
+      <w:r>
+        <w:rPr>
+          <w:rFonts w:ascii="Times New Roman" w:hAnsi="Times New Roman" w:eastAsia="Times New Roman" w:cs="Times New Roman"/>
+          <w:noProof w:val="0"/>
+          <w:color w:val="000000" w:themeColor="text1" w:themeTint="FF" w:themeShade="FF"/>
+          <w:sz w:val="24"/>
+          <w:szCs w:val="24"/>
+          <w:lang w:val="en-US"/>
+        </w:rPr>
+        <w:t>menjadi</w:t>
+      </w:r>
+      <w:r>
+        <w:rPr>
+          <w:rFonts w:ascii="Times New Roman" w:hAnsi="Times New Roman" w:eastAsia="Times New Roman" w:cs="Times New Roman"/>
+          <w:noProof w:val="0"/>
+          <w:color w:val="000000" w:themeColor="text1" w:themeTint="FF" w:themeShade="FF"/>
+          <w:sz w:val="24"/>
+          <w:szCs w:val="24"/>
+          <w:lang w:val="en-US"/>
+        </w:rPr>
+        <w:t xml:space="preserve"> </w:t>
+      </w:r>
+      <w:r>
+        <w:rPr>
+          <w:rFonts w:ascii="Times New Roman" w:hAnsi="Times New Roman" w:eastAsia="Times New Roman" w:cs="Times New Roman"/>
+          <w:noProof w:val="0"/>
+          <w:color w:val="000000" w:themeColor="text1" w:themeTint="FF" w:themeShade="FF"/>
+          <w:sz w:val="24"/>
+          <w:szCs w:val="24"/>
+          <w:lang w:val="en-US"/>
+        </w:rPr>
+        <w:t>menit</w:t>
+      </w:r>
+      <w:r>
+        <w:rPr>
+          <w:rFonts w:ascii="Times New Roman" w:hAnsi="Times New Roman" w:eastAsia="Times New Roman" w:cs="Times New Roman"/>
+          <w:noProof w:val="0"/>
+          <w:color w:val="000000" w:themeColor="text1" w:themeTint="FF" w:themeShade="FF"/>
+          <w:sz w:val="24"/>
+          <w:szCs w:val="24"/>
+          <w:lang w:val="en-US"/>
+        </w:rPr>
+        <w:t xml:space="preserve"> </w:t>
+      </w:r>
+      <w:r>
+        <w:rPr>
+          <w:rFonts w:ascii="Times New Roman" w:hAnsi="Times New Roman" w:eastAsia="Times New Roman" w:cs="Times New Roman"/>
+          <w:noProof w:val="0"/>
+          <w:color w:val="000000" w:themeColor="text1" w:themeTint="FF" w:themeShade="FF"/>
+          <w:sz w:val="24"/>
+          <w:szCs w:val="24"/>
+          <w:lang w:val="en-US"/>
+        </w:rPr>
+        <w:t>riil</w:t>
+      </w:r>
+      <w:r>
+        <w:rPr>
+          <w:rFonts w:ascii="Times New Roman" w:hAnsi="Times New Roman" w:eastAsia="Times New Roman" w:cs="Times New Roman"/>
+          <w:noProof w:val="0"/>
+          <w:color w:val="000000" w:themeColor="text1" w:themeTint="FF" w:themeShade="FF"/>
+          <w:sz w:val="24"/>
+          <w:szCs w:val="24"/>
+          <w:lang w:val="en-US"/>
+        </w:rPr>
+        <w:t>.</w:t>
+      </w:r>
+      <w:r>
+        <w:rPr>
+          <w:rFonts w:ascii="Times New Roman" w:hAnsi="Times New Roman" w:eastAsia="Times New Roman" w:cs="Times New Roman"/>
+          <w:noProof w:val="0"/>
+          <w:color w:val="000000" w:themeColor="text1" w:themeTint="FF" w:themeShade="FF"/>
+          <w:sz w:val="24"/>
+          <w:szCs w:val="24"/>
+          <w:lang w:val="en-US"/>
+        </w:rPr>
+        <w:t xml:space="preserve"> </w:t>
+      </w:r>
+      <w:r>
+        <w:rPr>
+          <w:rFonts w:ascii="Times New Roman" w:hAnsi="Times New Roman" w:eastAsia="Times New Roman" w:cs="Times New Roman"/>
+          <w:noProof w:val="0"/>
+          <w:color w:val="000000" w:themeColor="text1" w:themeTint="FF" w:themeShade="FF"/>
+          <w:sz w:val="24"/>
+          <w:szCs w:val="24"/>
+          <w:lang w:val="en-US"/>
+        </w:rPr>
+        <w:t>Lingkungan</w:t>
+      </w:r>
+      <w:r>
+        <w:rPr>
+          <w:rFonts w:ascii="Times New Roman" w:hAnsi="Times New Roman" w:eastAsia="Times New Roman" w:cs="Times New Roman"/>
+          <w:noProof w:val="0"/>
+          <w:color w:val="000000" w:themeColor="text1" w:themeTint="FF" w:themeShade="FF"/>
+          <w:sz w:val="24"/>
+          <w:szCs w:val="24"/>
+          <w:lang w:val="en-US"/>
+        </w:rPr>
+        <w:t xml:space="preserve"> </w:t>
+      </w:r>
+      <w:r>
+        <w:rPr>
+          <w:rFonts w:ascii="Times New Roman" w:hAnsi="Times New Roman" w:eastAsia="Times New Roman" w:cs="Times New Roman"/>
+          <w:noProof w:val="0"/>
+          <w:color w:val="000000" w:themeColor="text1" w:themeTint="FF" w:themeShade="FF"/>
+          <w:sz w:val="24"/>
+          <w:szCs w:val="24"/>
+          <w:lang w:val="en-US"/>
+        </w:rPr>
+        <w:t>pengujian</w:t>
+      </w:r>
+      <w:r>
+        <w:rPr>
+          <w:rFonts w:ascii="Times New Roman" w:hAnsi="Times New Roman" w:eastAsia="Times New Roman" w:cs="Times New Roman"/>
+          <w:noProof w:val="0"/>
+          <w:color w:val="000000" w:themeColor="text1" w:themeTint="FF" w:themeShade="FF"/>
+          <w:sz w:val="24"/>
+          <w:szCs w:val="24"/>
+          <w:lang w:val="en-US"/>
+        </w:rPr>
+        <w:t xml:space="preserve">: Windows, OpenJDK 21.0.10, </w:t>
+      </w:r>
+      <w:r>
+        <w:rPr>
+          <w:rFonts w:ascii="Times New Roman" w:hAnsi="Times New Roman" w:eastAsia="Times New Roman" w:cs="Times New Roman"/>
+          <w:noProof w:val="0"/>
+          <w:color w:val="000000" w:themeColor="text1" w:themeTint="FF" w:themeShade="FF"/>
+          <w:sz w:val="24"/>
+          <w:szCs w:val="24"/>
+          <w:lang w:val="en-US"/>
+        </w:rPr>
+        <w:t>19-10-2026 01:23:57 WIB</w:t>
+      </w:r>
+      <w:r>
+        <w:rPr>
+          <w:rFonts w:ascii="Times New Roman" w:hAnsi="Times New Roman" w:eastAsia="Times New Roman" w:cs="Times New Roman"/>
+          <w:noProof w:val="0"/>
+          <w:color w:val="000000" w:themeColor="text1" w:themeTint="FF" w:themeShade="FF"/>
+          <w:sz w:val="24"/>
+          <w:szCs w:val="24"/>
+          <w:lang w:val="en-US"/>
+        </w:rPr>
+        <w:t xml:space="preserve">. </w:t>
+      </w:r>
+      <w:r>
+        <w:rPr>
+          <w:rFonts w:ascii="Times New Roman" w:hAnsi="Times New Roman" w:eastAsia="Times New Roman" w:cs="Times New Roman"/>
+          <w:noProof w:val="0"/>
+          <w:color w:val="000000" w:themeColor="text1" w:themeTint="FF" w:themeShade="FF"/>
+          <w:sz w:val="24"/>
+          <w:szCs w:val="24"/>
+          <w:lang w:val="en-US"/>
+        </w:rPr>
+        <w:t>Hasilnya</w:t>
+      </w:r>
+      <w:r>
+        <w:rPr>
+          <w:rFonts w:ascii="Times New Roman" w:hAnsi="Times New Roman" w:eastAsia="Times New Roman" w:cs="Times New Roman"/>
+          <w:noProof w:val="0"/>
+          <w:color w:val="000000" w:themeColor="text1" w:themeTint="FF" w:themeShade="FF"/>
+          <w:sz w:val="24"/>
+          <w:szCs w:val="24"/>
+          <w:lang w:val="en-US"/>
+        </w:rPr>
+        <w:t xml:space="preserve"> </w:t>
+      </w:r>
+      <w:r>
+        <w:rPr>
+          <w:rFonts w:ascii="Times New Roman" w:hAnsi="Times New Roman" w:eastAsia="Times New Roman" w:cs="Times New Roman"/>
+          <w:noProof w:val="0"/>
+          <w:color w:val="000000" w:themeColor="text1" w:themeTint="FF" w:themeShade="FF"/>
+          <w:sz w:val="24"/>
+          <w:szCs w:val="24"/>
+          <w:lang w:val="en-US"/>
+        </w:rPr>
+        <w:t>tidak</w:t>
+      </w:r>
+      <w:r>
+        <w:rPr>
+          <w:rFonts w:ascii="Times New Roman" w:hAnsi="Times New Roman" w:eastAsia="Times New Roman" w:cs="Times New Roman"/>
+          <w:noProof w:val="0"/>
+          <w:color w:val="000000" w:themeColor="text1" w:themeTint="FF" w:themeShade="FF"/>
+          <w:sz w:val="24"/>
+          <w:szCs w:val="24"/>
+          <w:lang w:val="en-US"/>
+        </w:rPr>
+        <w:t xml:space="preserve"> </w:t>
+      </w:r>
+      <w:r>
+        <w:rPr>
+          <w:rFonts w:ascii="Times New Roman" w:hAnsi="Times New Roman" w:eastAsia="Times New Roman" w:cs="Times New Roman"/>
+          <w:noProof w:val="0"/>
+          <w:color w:val="000000" w:themeColor="text1" w:themeTint="FF" w:themeShade="FF"/>
+          <w:sz w:val="24"/>
+          <w:szCs w:val="24"/>
+          <w:lang w:val="en-US"/>
+        </w:rPr>
+        <w:t>menggantikan</w:t>
+      </w:r>
+      <w:r>
+        <w:rPr>
+          <w:rFonts w:ascii="Times New Roman" w:hAnsi="Times New Roman" w:eastAsia="Times New Roman" w:cs="Times New Roman"/>
+          <w:noProof w:val="0"/>
+          <w:color w:val="000000" w:themeColor="text1" w:themeTint="FF" w:themeShade="FF"/>
+          <w:sz w:val="24"/>
+          <w:szCs w:val="24"/>
+          <w:lang w:val="en-US"/>
+        </w:rPr>
+        <w:t xml:space="preserve"> </w:t>
+      </w:r>
+      <w:r>
+        <w:rPr>
+          <w:rFonts w:ascii="Times New Roman" w:hAnsi="Times New Roman" w:eastAsia="Times New Roman" w:cs="Times New Roman"/>
+          <w:noProof w:val="0"/>
+          <w:color w:val="000000" w:themeColor="text1" w:themeTint="FF" w:themeShade="FF"/>
+          <w:sz w:val="24"/>
+          <w:szCs w:val="24"/>
+          <w:lang w:val="en-US"/>
+        </w:rPr>
+        <w:t>tabel</w:t>
+      </w:r>
+      <w:r>
+        <w:rPr>
+          <w:rFonts w:ascii="Times New Roman" w:hAnsi="Times New Roman" w:eastAsia="Times New Roman" w:cs="Times New Roman"/>
+          <w:noProof w:val="0"/>
+          <w:color w:val="000000" w:themeColor="text1" w:themeTint="FF" w:themeShade="FF"/>
+          <w:sz w:val="24"/>
+          <w:szCs w:val="24"/>
+          <w:lang w:val="en-US"/>
+        </w:rPr>
+        <w:t xml:space="preserve"> </w:t>
+      </w:r>
+      <w:r>
+        <w:rPr>
+          <w:rFonts w:ascii="Times New Roman" w:hAnsi="Times New Roman" w:eastAsia="Times New Roman" w:cs="Times New Roman"/>
+          <w:noProof w:val="0"/>
+          <w:color w:val="000000" w:themeColor="text1" w:themeTint="FF" w:themeShade="FF"/>
+          <w:sz w:val="24"/>
+          <w:szCs w:val="24"/>
+          <w:lang w:val="en-US"/>
+        </w:rPr>
+        <w:t>Anggota</w:t>
+      </w:r>
+      <w:r>
+        <w:rPr>
+          <w:rFonts w:ascii="Times New Roman" w:hAnsi="Times New Roman" w:eastAsia="Times New Roman" w:cs="Times New Roman"/>
+          <w:noProof w:val="0"/>
+          <w:color w:val="000000" w:themeColor="text1" w:themeTint="FF" w:themeShade="FF"/>
+          <w:sz w:val="24"/>
+          <w:szCs w:val="24"/>
+          <w:lang w:val="en-US"/>
+        </w:rPr>
+        <w:t xml:space="preserve"> 4.</w:t>
       </w:r>
     </w:p>
     <w:tbl>
@@ -7253,34 +7794,743 @@
       <w:pPr>
         <w:spacing w:before="0" w:beforeAutospacing="off" w:after="120" w:afterAutospacing="off" w:line="276" w:lineRule="auto"/>
         <w:jc w:val="both"/>
-      </w:pPr>
-      <w:r>
-        <w:rPr>
-          <w:rFonts w:ascii="Times New Roman" w:hAnsi="Times New Roman" w:eastAsia="Times New Roman" w:cs="Times New Roman"/>
-          <w:noProof w:val="0"/>
-          <w:color w:val="000000" w:themeColor="text1" w:themeTint="FF" w:themeShade="FF"/>
-          <w:sz w:val="24"/>
-          <w:szCs w:val="24"/>
-          <w:lang w:val="en-US"/>
-        </w:rPr>
-        <w:t>Program dikompilasi menggunakan javac -encoding UTF-8. Gambar berikut menyajikan transkrip keluaran Java aktual dari uji ulang, bukan screenshot IDE. Berkas output_program.txt menyimpan keluaran lengkapnya.</w:t>
+        <w:rPr>
+          <w:rFonts w:ascii="Times New Roman" w:hAnsi="Times New Roman" w:eastAsia="Times New Roman" w:cs="Times New Roman"/>
+          <w:noProof w:val="0"/>
+          <w:color w:val="000000" w:themeColor="text1" w:themeTint="FF" w:themeShade="FF"/>
+          <w:sz w:val="24"/>
+          <w:szCs w:val="24"/>
+          <w:lang w:val="en-US"/>
+        </w:rPr>
+      </w:pPr>
+      <w:r>
+        <w:rPr>
+          <w:rFonts w:ascii="Times New Roman" w:hAnsi="Times New Roman" w:eastAsia="Times New Roman" w:cs="Times New Roman"/>
+          <w:noProof w:val="0"/>
+          <w:color w:val="000000" w:themeColor="text1" w:themeTint="FF" w:themeShade="FF"/>
+          <w:sz w:val="24"/>
+          <w:szCs w:val="24"/>
+          <w:lang w:val="en-US"/>
+        </w:rPr>
+        <w:t xml:space="preserve">Program </w:t>
+      </w:r>
+      <w:r>
+        <w:rPr>
+          <w:rFonts w:ascii="Times New Roman" w:hAnsi="Times New Roman" w:eastAsia="Times New Roman" w:cs="Times New Roman"/>
+          <w:noProof w:val="0"/>
+          <w:color w:val="000000" w:themeColor="text1" w:themeTint="FF" w:themeShade="FF"/>
+          <w:sz w:val="24"/>
+          <w:szCs w:val="24"/>
+          <w:lang w:val="en-US"/>
+        </w:rPr>
+        <w:t>dikompilasi</w:t>
+      </w:r>
+      <w:r>
+        <w:rPr>
+          <w:rFonts w:ascii="Times New Roman" w:hAnsi="Times New Roman" w:eastAsia="Times New Roman" w:cs="Times New Roman"/>
+          <w:noProof w:val="0"/>
+          <w:color w:val="000000" w:themeColor="text1" w:themeTint="FF" w:themeShade="FF"/>
+          <w:sz w:val="24"/>
+          <w:szCs w:val="24"/>
+          <w:lang w:val="en-US"/>
+        </w:rPr>
+        <w:t xml:space="preserve"> </w:t>
+      </w:r>
+      <w:r>
+        <w:rPr>
+          <w:rFonts w:ascii="Times New Roman" w:hAnsi="Times New Roman" w:eastAsia="Times New Roman" w:cs="Times New Roman"/>
+          <w:noProof w:val="0"/>
+          <w:color w:val="000000" w:themeColor="text1" w:themeTint="FF" w:themeShade="FF"/>
+          <w:sz w:val="24"/>
+          <w:szCs w:val="24"/>
+          <w:lang w:val="en-US"/>
+        </w:rPr>
+        <w:t>menggunakan</w:t>
+      </w:r>
+      <w:r>
+        <w:rPr>
+          <w:rFonts w:ascii="Times New Roman" w:hAnsi="Times New Roman" w:eastAsia="Times New Roman" w:cs="Times New Roman"/>
+          <w:noProof w:val="0"/>
+          <w:color w:val="000000" w:themeColor="text1" w:themeTint="FF" w:themeShade="FF"/>
+          <w:sz w:val="24"/>
+          <w:szCs w:val="24"/>
+          <w:lang w:val="en-US"/>
+        </w:rPr>
+        <w:t xml:space="preserve"> </w:t>
+      </w:r>
+      <w:r>
+        <w:rPr>
+          <w:rFonts w:ascii="Times New Roman" w:hAnsi="Times New Roman" w:eastAsia="Times New Roman" w:cs="Times New Roman"/>
+          <w:noProof w:val="0"/>
+          <w:color w:val="000000" w:themeColor="text1" w:themeTint="FF" w:themeShade="FF"/>
+          <w:sz w:val="24"/>
+          <w:szCs w:val="24"/>
+          <w:lang w:val="en-US"/>
+        </w:rPr>
+        <w:t>javac</w:t>
+      </w:r>
+      <w:r>
+        <w:rPr>
+          <w:rFonts w:ascii="Times New Roman" w:hAnsi="Times New Roman" w:eastAsia="Times New Roman" w:cs="Times New Roman"/>
+          <w:noProof w:val="0"/>
+          <w:color w:val="000000" w:themeColor="text1" w:themeTint="FF" w:themeShade="FF"/>
+          <w:sz w:val="24"/>
+          <w:szCs w:val="24"/>
+          <w:lang w:val="en-US"/>
+        </w:rPr>
+        <w:t xml:space="preserve"> -encoding UTF-8. </w:t>
+      </w:r>
+      <w:r>
+        <w:rPr>
+          <w:rFonts w:ascii="Times New Roman" w:hAnsi="Times New Roman" w:eastAsia="Times New Roman" w:cs="Times New Roman"/>
+          <w:noProof w:val="0"/>
+          <w:color w:val="000000" w:themeColor="text1" w:themeTint="FF" w:themeShade="FF"/>
+          <w:sz w:val="24"/>
+          <w:szCs w:val="24"/>
+          <w:lang w:val="en-US"/>
+        </w:rPr>
+        <w:t xml:space="preserve">Gambar </w:t>
+      </w:r>
+      <w:r>
+        <w:rPr>
+          <w:rFonts w:ascii="Times New Roman" w:hAnsi="Times New Roman" w:eastAsia="Times New Roman" w:cs="Times New Roman"/>
+          <w:noProof w:val="0"/>
+          <w:color w:val="000000" w:themeColor="text1" w:themeTint="FF" w:themeShade="FF"/>
+          <w:sz w:val="24"/>
+          <w:szCs w:val="24"/>
+          <w:lang w:val="en-US"/>
+        </w:rPr>
+        <w:t>berikut</w:t>
+      </w:r>
+      <w:r>
+        <w:rPr>
+          <w:rFonts w:ascii="Times New Roman" w:hAnsi="Times New Roman" w:eastAsia="Times New Roman" w:cs="Times New Roman"/>
+          <w:noProof w:val="0"/>
+          <w:color w:val="000000" w:themeColor="text1" w:themeTint="FF" w:themeShade="FF"/>
+          <w:sz w:val="24"/>
+          <w:szCs w:val="24"/>
+          <w:lang w:val="en-US"/>
+        </w:rPr>
+        <w:t xml:space="preserve"> </w:t>
+      </w:r>
+      <w:r>
+        <w:rPr>
+          <w:rFonts w:ascii="Times New Roman" w:hAnsi="Times New Roman" w:eastAsia="Times New Roman" w:cs="Times New Roman"/>
+          <w:noProof w:val="0"/>
+          <w:color w:val="000000" w:themeColor="text1" w:themeTint="FF" w:themeShade="FF"/>
+          <w:sz w:val="24"/>
+          <w:szCs w:val="24"/>
+          <w:lang w:val="en-US"/>
+        </w:rPr>
+        <w:t>menyajikan</w:t>
+      </w:r>
+      <w:r>
+        <w:rPr>
+          <w:rFonts w:ascii="Times New Roman" w:hAnsi="Times New Roman" w:eastAsia="Times New Roman" w:cs="Times New Roman"/>
+          <w:noProof w:val="0"/>
+          <w:color w:val="000000" w:themeColor="text1" w:themeTint="FF" w:themeShade="FF"/>
+          <w:sz w:val="24"/>
+          <w:szCs w:val="24"/>
+          <w:lang w:val="en-US"/>
+        </w:rPr>
+        <w:t xml:space="preserve"> </w:t>
+      </w:r>
+      <w:r>
+        <w:rPr>
+          <w:rFonts w:ascii="Times New Roman" w:hAnsi="Times New Roman" w:eastAsia="Times New Roman" w:cs="Times New Roman"/>
+          <w:noProof w:val="0"/>
+          <w:color w:val="000000" w:themeColor="text1" w:themeTint="FF" w:themeShade="FF"/>
+          <w:sz w:val="24"/>
+          <w:szCs w:val="24"/>
+          <w:lang w:val="en-US"/>
+        </w:rPr>
+        <w:t>transkrip</w:t>
+      </w:r>
+      <w:r>
+        <w:rPr>
+          <w:rFonts w:ascii="Times New Roman" w:hAnsi="Times New Roman" w:eastAsia="Times New Roman" w:cs="Times New Roman"/>
+          <w:noProof w:val="0"/>
+          <w:color w:val="000000" w:themeColor="text1" w:themeTint="FF" w:themeShade="FF"/>
+          <w:sz w:val="24"/>
+          <w:szCs w:val="24"/>
+          <w:lang w:val="en-US"/>
+        </w:rPr>
+        <w:t xml:space="preserve"> </w:t>
+      </w:r>
+      <w:r>
+        <w:rPr>
+          <w:rFonts w:ascii="Times New Roman" w:hAnsi="Times New Roman" w:eastAsia="Times New Roman" w:cs="Times New Roman"/>
+          <w:noProof w:val="0"/>
+          <w:color w:val="000000" w:themeColor="text1" w:themeTint="FF" w:themeShade="FF"/>
+          <w:sz w:val="24"/>
+          <w:szCs w:val="24"/>
+          <w:lang w:val="en-US"/>
+        </w:rPr>
+        <w:t>keluaran</w:t>
+      </w:r>
+      <w:r>
+        <w:rPr>
+          <w:rFonts w:ascii="Times New Roman" w:hAnsi="Times New Roman" w:eastAsia="Times New Roman" w:cs="Times New Roman"/>
+          <w:noProof w:val="0"/>
+          <w:color w:val="000000" w:themeColor="text1" w:themeTint="FF" w:themeShade="FF"/>
+          <w:sz w:val="24"/>
+          <w:szCs w:val="24"/>
+          <w:lang w:val="en-US"/>
+        </w:rPr>
+        <w:t xml:space="preserve"> Java </w:t>
+      </w:r>
+      <w:r>
+        <w:rPr>
+          <w:rFonts w:ascii="Times New Roman" w:hAnsi="Times New Roman" w:eastAsia="Times New Roman" w:cs="Times New Roman"/>
+          <w:noProof w:val="0"/>
+          <w:color w:val="000000" w:themeColor="text1" w:themeTint="FF" w:themeShade="FF"/>
+          <w:sz w:val="24"/>
+          <w:szCs w:val="24"/>
+          <w:lang w:val="en-US"/>
+        </w:rPr>
+        <w:t>aktual</w:t>
+      </w:r>
+      <w:r>
+        <w:rPr>
+          <w:rFonts w:ascii="Times New Roman" w:hAnsi="Times New Roman" w:eastAsia="Times New Roman" w:cs="Times New Roman"/>
+          <w:noProof w:val="0"/>
+          <w:color w:val="000000" w:themeColor="text1" w:themeTint="FF" w:themeShade="FF"/>
+          <w:sz w:val="24"/>
+          <w:szCs w:val="24"/>
+          <w:lang w:val="en-US"/>
+        </w:rPr>
+        <w:t xml:space="preserve"> </w:t>
+      </w:r>
+      <w:r>
+        <w:rPr>
+          <w:rFonts w:ascii="Times New Roman" w:hAnsi="Times New Roman" w:eastAsia="Times New Roman" w:cs="Times New Roman"/>
+          <w:noProof w:val="0"/>
+          <w:color w:val="000000" w:themeColor="text1" w:themeTint="FF" w:themeShade="FF"/>
+          <w:sz w:val="24"/>
+          <w:szCs w:val="24"/>
+          <w:lang w:val="en-US"/>
+        </w:rPr>
+        <w:t>dari</w:t>
+      </w:r>
+      <w:r>
+        <w:rPr>
+          <w:rFonts w:ascii="Times New Roman" w:hAnsi="Times New Roman" w:eastAsia="Times New Roman" w:cs="Times New Roman"/>
+          <w:noProof w:val="0"/>
+          <w:color w:val="000000" w:themeColor="text1" w:themeTint="FF" w:themeShade="FF"/>
+          <w:sz w:val="24"/>
+          <w:szCs w:val="24"/>
+          <w:lang w:val="en-US"/>
+        </w:rPr>
+        <w:t xml:space="preserve"> uji </w:t>
+      </w:r>
+      <w:r>
+        <w:rPr>
+          <w:rFonts w:ascii="Times New Roman" w:hAnsi="Times New Roman" w:eastAsia="Times New Roman" w:cs="Times New Roman"/>
+          <w:noProof w:val="0"/>
+          <w:color w:val="000000" w:themeColor="text1" w:themeTint="FF" w:themeShade="FF"/>
+          <w:sz w:val="24"/>
+          <w:szCs w:val="24"/>
+          <w:lang w:val="en-US"/>
+        </w:rPr>
+        <w:t>ulang</w:t>
+      </w:r>
+      <w:r>
+        <w:rPr>
+          <w:rFonts w:ascii="Times New Roman" w:hAnsi="Times New Roman" w:eastAsia="Times New Roman" w:cs="Times New Roman"/>
+          <w:noProof w:val="0"/>
+          <w:color w:val="000000" w:themeColor="text1" w:themeTint="FF" w:themeShade="FF"/>
+          <w:sz w:val="24"/>
+          <w:szCs w:val="24"/>
+          <w:lang w:val="en-US"/>
+        </w:rPr>
+        <w:t xml:space="preserve">, </w:t>
+      </w:r>
+      <w:r>
+        <w:rPr>
+          <w:rFonts w:ascii="Times New Roman" w:hAnsi="Times New Roman" w:eastAsia="Times New Roman" w:cs="Times New Roman"/>
+          <w:noProof w:val="0"/>
+          <w:color w:val="000000" w:themeColor="text1" w:themeTint="FF" w:themeShade="FF"/>
+          <w:sz w:val="24"/>
+          <w:szCs w:val="24"/>
+          <w:lang w:val="en-US"/>
+        </w:rPr>
+        <w:t>bukan</w:t>
+      </w:r>
+      <w:r>
+        <w:rPr>
+          <w:rFonts w:ascii="Times New Roman" w:hAnsi="Times New Roman" w:eastAsia="Times New Roman" w:cs="Times New Roman"/>
+          <w:noProof w:val="0"/>
+          <w:color w:val="000000" w:themeColor="text1" w:themeTint="FF" w:themeShade="FF"/>
+          <w:sz w:val="24"/>
+          <w:szCs w:val="24"/>
+          <w:lang w:val="en-US"/>
+        </w:rPr>
+        <w:t xml:space="preserve"> screenshot IDE.</w:t>
+      </w:r>
+      <w:r>
+        <w:rPr>
+          <w:rFonts w:ascii="Times New Roman" w:hAnsi="Times New Roman" w:eastAsia="Times New Roman" w:cs="Times New Roman"/>
+          <w:noProof w:val="0"/>
+          <w:color w:val="000000" w:themeColor="text1" w:themeTint="FF" w:themeShade="FF"/>
+          <w:sz w:val="24"/>
+          <w:szCs w:val="24"/>
+          <w:lang w:val="en-US"/>
+        </w:rPr>
+        <w:t xml:space="preserve"> </w:t>
+      </w:r>
+      <w:r>
+        <w:rPr>
+          <w:rFonts w:ascii="Times New Roman" w:hAnsi="Times New Roman" w:eastAsia="Times New Roman" w:cs="Times New Roman"/>
+          <w:noProof w:val="0"/>
+          <w:color w:val="000000" w:themeColor="text1" w:themeTint="FF" w:themeShade="FF"/>
+          <w:sz w:val="24"/>
+          <w:szCs w:val="24"/>
+          <w:lang w:val="en-US"/>
+        </w:rPr>
+        <w:t>Berkas output_program.txt menyimpan keluaran lengkapnya.</w:t>
       </w:r>
     </w:p>
     <w:p>
       <w:pPr>
         <w:spacing w:before="0" w:beforeAutospacing="off" w:after="120" w:afterAutospacing="off" w:line="276" w:lineRule="auto"/>
         <w:jc w:val="both"/>
-      </w:pPr>
-      <w:r>
-        <w:rPr>
-          <w:rFonts w:ascii="Times New Roman" w:hAnsi="Times New Roman" w:eastAsia="Times New Roman" w:cs="Times New Roman"/>
-          <w:noProof w:val="0"/>
-          <w:color w:val="000000" w:themeColor="text1" w:themeTint="FF" w:themeShade="FF"/>
-          <w:sz w:val="24"/>
-          <w:szCs w:val="24"/>
-          <w:lang w:val="en-US"/>
-        </w:rPr>
-        <w:t>Total 10 lagu adalah 44 menit 22 detik (44,37 menit riil). Durasi terpanjang adalah 7 menit 29 detik, yaitu IN THE NAME OF LOVE. Data awal memakai M.SS: 4.23 berarti 4 menit 23 detik, sesuai tugas sebelumnya. Constructor mengubahnya menjadi menit riil sebelum rekursi; keluaran memakai menit:detik.</w:t>
+        <w:rPr>
+          <w:rFonts w:ascii="Times New Roman" w:hAnsi="Times New Roman" w:eastAsia="Times New Roman" w:cs="Times New Roman"/>
+          <w:noProof w:val="0"/>
+          <w:color w:val="000000" w:themeColor="text1" w:themeTint="FF" w:themeShade="FF"/>
+          <w:sz w:val="24"/>
+          <w:szCs w:val="24"/>
+          <w:lang w:val="en-US"/>
+        </w:rPr>
+      </w:pPr>
+      <w:r>
+        <w:rPr>
+          <w:rFonts w:ascii="Times New Roman" w:hAnsi="Times New Roman" w:eastAsia="Times New Roman" w:cs="Times New Roman"/>
+          <w:noProof w:val="0"/>
+          <w:color w:val="000000" w:themeColor="text1" w:themeTint="FF" w:themeShade="FF"/>
+          <w:sz w:val="24"/>
+          <w:szCs w:val="24"/>
+          <w:lang w:val="en-US"/>
+        </w:rPr>
+        <w:t>Total 10 lagu adalah 44 menit 22 detik (44,37 menit riil). Durasi terpanjang adalah 7 menit 29 detik, yaitu IN THE NAME OF LOVE.</w:t>
+      </w:r>
+      <w:r>
+        <w:rPr>
+          <w:rFonts w:ascii="Times New Roman" w:hAnsi="Times New Roman" w:eastAsia="Times New Roman" w:cs="Times New Roman"/>
+          <w:noProof w:val="0"/>
+          <w:color w:val="000000" w:themeColor="text1" w:themeTint="FF" w:themeShade="FF"/>
+          <w:sz w:val="24"/>
+          <w:szCs w:val="24"/>
+          <w:lang w:val="en-US"/>
+        </w:rPr>
+        <w:t xml:space="preserve"> </w:t>
+      </w:r>
+      <w:r>
+        <w:rPr>
+          <w:rFonts w:ascii="Times New Roman" w:hAnsi="Times New Roman" w:eastAsia="Times New Roman" w:cs="Times New Roman"/>
+          <w:noProof w:val="0"/>
+          <w:color w:val="000000" w:themeColor="text1" w:themeTint="FF" w:themeShade="FF"/>
+          <w:sz w:val="24"/>
+          <w:szCs w:val="24"/>
+          <w:lang w:val="en-US"/>
+        </w:rPr>
+        <w:t xml:space="preserve">Data </w:t>
+      </w:r>
+      <w:r>
+        <w:rPr>
+          <w:rFonts w:ascii="Times New Roman" w:hAnsi="Times New Roman" w:eastAsia="Times New Roman" w:cs="Times New Roman"/>
+          <w:noProof w:val="0"/>
+          <w:color w:val="000000" w:themeColor="text1" w:themeTint="FF" w:themeShade="FF"/>
+          <w:sz w:val="24"/>
+          <w:szCs w:val="24"/>
+          <w:lang w:val="en-US"/>
+        </w:rPr>
+        <w:t>awal</w:t>
+      </w:r>
+      <w:r>
+        <w:rPr>
+          <w:rFonts w:ascii="Times New Roman" w:hAnsi="Times New Roman" w:eastAsia="Times New Roman" w:cs="Times New Roman"/>
+          <w:noProof w:val="0"/>
+          <w:color w:val="000000" w:themeColor="text1" w:themeTint="FF" w:themeShade="FF"/>
+          <w:sz w:val="24"/>
+          <w:szCs w:val="24"/>
+          <w:lang w:val="en-US"/>
+        </w:rPr>
+        <w:t xml:space="preserve"> </w:t>
+      </w:r>
+      <w:r>
+        <w:rPr>
+          <w:rFonts w:ascii="Times New Roman" w:hAnsi="Times New Roman" w:eastAsia="Times New Roman" w:cs="Times New Roman"/>
+          <w:noProof w:val="0"/>
+          <w:color w:val="000000" w:themeColor="text1" w:themeTint="FF" w:themeShade="FF"/>
+          <w:sz w:val="24"/>
+          <w:szCs w:val="24"/>
+          <w:lang w:val="en-US"/>
+        </w:rPr>
+        <w:t>memakai</w:t>
+      </w:r>
+      <w:r>
+        <w:rPr>
+          <w:rFonts w:ascii="Times New Roman" w:hAnsi="Times New Roman" w:eastAsia="Times New Roman" w:cs="Times New Roman"/>
+          <w:noProof w:val="0"/>
+          <w:color w:val="000000" w:themeColor="text1" w:themeTint="FF" w:themeShade="FF"/>
+          <w:sz w:val="24"/>
+          <w:szCs w:val="24"/>
+          <w:lang w:val="en-US"/>
+        </w:rPr>
+        <w:t xml:space="preserve"> </w:t>
+      </w:r>
+      <w:r>
+        <w:rPr>
+          <w:rFonts w:ascii="Times New Roman" w:hAnsi="Times New Roman" w:eastAsia="Times New Roman" w:cs="Times New Roman"/>
+          <w:noProof w:val="0"/>
+          <w:color w:val="000000" w:themeColor="text1" w:themeTint="FF" w:themeShade="FF"/>
+          <w:sz w:val="24"/>
+          <w:szCs w:val="24"/>
+          <w:lang w:val="en-US"/>
+        </w:rPr>
+        <w:t>M.SS</w:t>
+      </w:r>
+      <w:r>
+        <w:rPr>
+          <w:rFonts w:ascii="Times New Roman" w:hAnsi="Times New Roman" w:eastAsia="Times New Roman" w:cs="Times New Roman"/>
+          <w:noProof w:val="0"/>
+          <w:color w:val="000000" w:themeColor="text1" w:themeTint="FF" w:themeShade="FF"/>
+          <w:sz w:val="24"/>
+          <w:szCs w:val="24"/>
+          <w:lang w:val="en-US"/>
+        </w:rPr>
+        <w:t xml:space="preserve">: 4.23 </w:t>
+      </w:r>
+      <w:r>
+        <w:rPr>
+          <w:rFonts w:ascii="Times New Roman" w:hAnsi="Times New Roman" w:eastAsia="Times New Roman" w:cs="Times New Roman"/>
+          <w:noProof w:val="0"/>
+          <w:color w:val="000000" w:themeColor="text1" w:themeTint="FF" w:themeShade="FF"/>
+          <w:sz w:val="24"/>
+          <w:szCs w:val="24"/>
+          <w:lang w:val="en-US"/>
+        </w:rPr>
+        <w:t>berarti</w:t>
+      </w:r>
+      <w:r>
+        <w:rPr>
+          <w:rFonts w:ascii="Times New Roman" w:hAnsi="Times New Roman" w:eastAsia="Times New Roman" w:cs="Times New Roman"/>
+          <w:noProof w:val="0"/>
+          <w:color w:val="000000" w:themeColor="text1" w:themeTint="FF" w:themeShade="FF"/>
+          <w:sz w:val="24"/>
+          <w:szCs w:val="24"/>
+          <w:lang w:val="en-US"/>
+        </w:rPr>
+        <w:t xml:space="preserve"> 4 </w:t>
+      </w:r>
+      <w:r>
+        <w:rPr>
+          <w:rFonts w:ascii="Times New Roman" w:hAnsi="Times New Roman" w:eastAsia="Times New Roman" w:cs="Times New Roman"/>
+          <w:noProof w:val="0"/>
+          <w:color w:val="000000" w:themeColor="text1" w:themeTint="FF" w:themeShade="FF"/>
+          <w:sz w:val="24"/>
+          <w:szCs w:val="24"/>
+          <w:lang w:val="en-US"/>
+        </w:rPr>
+        <w:t>menit</w:t>
+      </w:r>
+      <w:r>
+        <w:rPr>
+          <w:rFonts w:ascii="Times New Roman" w:hAnsi="Times New Roman" w:eastAsia="Times New Roman" w:cs="Times New Roman"/>
+          <w:noProof w:val="0"/>
+          <w:color w:val="000000" w:themeColor="text1" w:themeTint="FF" w:themeShade="FF"/>
+          <w:sz w:val="24"/>
+          <w:szCs w:val="24"/>
+          <w:lang w:val="en-US"/>
+        </w:rPr>
+        <w:t xml:space="preserve"> 23 </w:t>
+      </w:r>
+      <w:r>
+        <w:rPr>
+          <w:rFonts w:ascii="Times New Roman" w:hAnsi="Times New Roman" w:eastAsia="Times New Roman" w:cs="Times New Roman"/>
+          <w:noProof w:val="0"/>
+          <w:color w:val="000000" w:themeColor="text1" w:themeTint="FF" w:themeShade="FF"/>
+          <w:sz w:val="24"/>
+          <w:szCs w:val="24"/>
+          <w:lang w:val="en-US"/>
+        </w:rPr>
+        <w:t>detik</w:t>
+      </w:r>
+      <w:r>
+        <w:rPr>
+          <w:rFonts w:ascii="Times New Roman" w:hAnsi="Times New Roman" w:eastAsia="Times New Roman" w:cs="Times New Roman"/>
+          <w:noProof w:val="0"/>
+          <w:color w:val="000000" w:themeColor="text1" w:themeTint="FF" w:themeShade="FF"/>
+          <w:sz w:val="24"/>
+          <w:szCs w:val="24"/>
+          <w:lang w:val="en-US"/>
+        </w:rPr>
+        <w:t xml:space="preserve">, </w:t>
+      </w:r>
+      <w:r>
+        <w:rPr>
+          <w:rFonts w:ascii="Times New Roman" w:hAnsi="Times New Roman" w:eastAsia="Times New Roman" w:cs="Times New Roman"/>
+          <w:noProof w:val="0"/>
+          <w:color w:val="000000" w:themeColor="text1" w:themeTint="FF" w:themeShade="FF"/>
+          <w:sz w:val="24"/>
+          <w:szCs w:val="24"/>
+          <w:lang w:val="en-US"/>
+        </w:rPr>
+        <w:t>sesuai</w:t>
+      </w:r>
+      <w:r>
+        <w:rPr>
+          <w:rFonts w:ascii="Times New Roman" w:hAnsi="Times New Roman" w:eastAsia="Times New Roman" w:cs="Times New Roman"/>
+          <w:noProof w:val="0"/>
+          <w:color w:val="000000" w:themeColor="text1" w:themeTint="FF" w:themeShade="FF"/>
+          <w:sz w:val="24"/>
+          <w:szCs w:val="24"/>
+          <w:lang w:val="en-US"/>
+        </w:rPr>
+        <w:t xml:space="preserve"> </w:t>
+      </w:r>
+      <w:r>
+        <w:rPr>
+          <w:rFonts w:ascii="Times New Roman" w:hAnsi="Times New Roman" w:eastAsia="Times New Roman" w:cs="Times New Roman"/>
+          <w:noProof w:val="0"/>
+          <w:color w:val="000000" w:themeColor="text1" w:themeTint="FF" w:themeShade="FF"/>
+          <w:sz w:val="24"/>
+          <w:szCs w:val="24"/>
+          <w:lang w:val="en-US"/>
+        </w:rPr>
+        <w:t>tugas</w:t>
+      </w:r>
+      <w:r>
+        <w:rPr>
+          <w:rFonts w:ascii="Times New Roman" w:hAnsi="Times New Roman" w:eastAsia="Times New Roman" w:cs="Times New Roman"/>
+          <w:noProof w:val="0"/>
+          <w:color w:val="000000" w:themeColor="text1" w:themeTint="FF" w:themeShade="FF"/>
+          <w:sz w:val="24"/>
+          <w:szCs w:val="24"/>
+          <w:lang w:val="en-US"/>
+        </w:rPr>
+        <w:t xml:space="preserve"> </w:t>
+      </w:r>
+      <w:r>
+        <w:rPr>
+          <w:rFonts w:ascii="Times New Roman" w:hAnsi="Times New Roman" w:eastAsia="Times New Roman" w:cs="Times New Roman"/>
+          <w:noProof w:val="0"/>
+          <w:color w:val="000000" w:themeColor="text1" w:themeTint="FF" w:themeShade="FF"/>
+          <w:sz w:val="24"/>
+          <w:szCs w:val="24"/>
+          <w:lang w:val="en-US"/>
+        </w:rPr>
+        <w:t>sebelumnya</w:t>
+      </w:r>
+      <w:r>
+        <w:rPr>
+          <w:rFonts w:ascii="Times New Roman" w:hAnsi="Times New Roman" w:eastAsia="Times New Roman" w:cs="Times New Roman"/>
+          <w:noProof w:val="0"/>
+          <w:color w:val="000000" w:themeColor="text1" w:themeTint="FF" w:themeShade="FF"/>
+          <w:sz w:val="24"/>
+          <w:szCs w:val="24"/>
+          <w:lang w:val="en-US"/>
+        </w:rPr>
+        <w:t xml:space="preserve">. Constructor </w:t>
+      </w:r>
+      <w:r>
+        <w:rPr>
+          <w:rFonts w:ascii="Times New Roman" w:hAnsi="Times New Roman" w:eastAsia="Times New Roman" w:cs="Times New Roman"/>
+          <w:noProof w:val="0"/>
+          <w:color w:val="000000" w:themeColor="text1" w:themeTint="FF" w:themeShade="FF"/>
+          <w:sz w:val="24"/>
+          <w:szCs w:val="24"/>
+          <w:lang w:val="en-US"/>
+        </w:rPr>
+        <w:t>mengubahnya</w:t>
+      </w:r>
+      <w:r>
+        <w:rPr>
+          <w:rFonts w:ascii="Times New Roman" w:hAnsi="Times New Roman" w:eastAsia="Times New Roman" w:cs="Times New Roman"/>
+          <w:noProof w:val="0"/>
+          <w:color w:val="000000" w:themeColor="text1" w:themeTint="FF" w:themeShade="FF"/>
+          <w:sz w:val="24"/>
+          <w:szCs w:val="24"/>
+          <w:lang w:val="en-US"/>
+        </w:rPr>
+        <w:t xml:space="preserve"> </w:t>
+      </w:r>
+      <w:r>
+        <w:rPr>
+          <w:rFonts w:ascii="Times New Roman" w:hAnsi="Times New Roman" w:eastAsia="Times New Roman" w:cs="Times New Roman"/>
+          <w:noProof w:val="0"/>
+          <w:color w:val="000000" w:themeColor="text1" w:themeTint="FF" w:themeShade="FF"/>
+          <w:sz w:val="24"/>
+          <w:szCs w:val="24"/>
+          <w:lang w:val="en-US"/>
+        </w:rPr>
+        <w:t>menjadi</w:t>
+      </w:r>
+      <w:r>
+        <w:rPr>
+          <w:rFonts w:ascii="Times New Roman" w:hAnsi="Times New Roman" w:eastAsia="Times New Roman" w:cs="Times New Roman"/>
+          <w:noProof w:val="0"/>
+          <w:color w:val="000000" w:themeColor="text1" w:themeTint="FF" w:themeShade="FF"/>
+          <w:sz w:val="24"/>
+          <w:szCs w:val="24"/>
+          <w:lang w:val="en-US"/>
+        </w:rPr>
+        <w:t xml:space="preserve"> </w:t>
+      </w:r>
+      <w:r>
+        <w:rPr>
+          <w:rFonts w:ascii="Times New Roman" w:hAnsi="Times New Roman" w:eastAsia="Times New Roman" w:cs="Times New Roman"/>
+          <w:noProof w:val="0"/>
+          <w:color w:val="000000" w:themeColor="text1" w:themeTint="FF" w:themeShade="FF"/>
+          <w:sz w:val="24"/>
+          <w:szCs w:val="24"/>
+          <w:lang w:val="en-US"/>
+        </w:rPr>
+        <w:t>menit</w:t>
+      </w:r>
+      <w:r>
+        <w:rPr>
+          <w:rFonts w:ascii="Times New Roman" w:hAnsi="Times New Roman" w:eastAsia="Times New Roman" w:cs="Times New Roman"/>
+          <w:noProof w:val="0"/>
+          <w:color w:val="000000" w:themeColor="text1" w:themeTint="FF" w:themeShade="FF"/>
+          <w:sz w:val="24"/>
+          <w:szCs w:val="24"/>
+          <w:lang w:val="en-US"/>
+        </w:rPr>
+        <w:t xml:space="preserve"> </w:t>
+      </w:r>
+      <w:r>
+        <w:rPr>
+          <w:rFonts w:ascii="Times New Roman" w:hAnsi="Times New Roman" w:eastAsia="Times New Roman" w:cs="Times New Roman"/>
+          <w:noProof w:val="0"/>
+          <w:color w:val="000000" w:themeColor="text1" w:themeTint="FF" w:themeShade="FF"/>
+          <w:sz w:val="24"/>
+          <w:szCs w:val="24"/>
+          <w:lang w:val="en-US"/>
+        </w:rPr>
+        <w:t>riil</w:t>
+      </w:r>
+      <w:r>
+        <w:rPr>
+          <w:rFonts w:ascii="Times New Roman" w:hAnsi="Times New Roman" w:eastAsia="Times New Roman" w:cs="Times New Roman"/>
+          <w:noProof w:val="0"/>
+          <w:color w:val="000000" w:themeColor="text1" w:themeTint="FF" w:themeShade="FF"/>
+          <w:sz w:val="24"/>
+          <w:szCs w:val="24"/>
+          <w:lang w:val="en-US"/>
+        </w:rPr>
+        <w:t xml:space="preserve"> </w:t>
+      </w:r>
+      <w:r>
+        <w:rPr>
+          <w:rFonts w:ascii="Times New Roman" w:hAnsi="Times New Roman" w:eastAsia="Times New Roman" w:cs="Times New Roman"/>
+          <w:noProof w:val="0"/>
+          <w:color w:val="000000" w:themeColor="text1" w:themeTint="FF" w:themeShade="FF"/>
+          <w:sz w:val="24"/>
+          <w:szCs w:val="24"/>
+          <w:lang w:val="en-US"/>
+        </w:rPr>
+        <w:t>sebelum</w:t>
+      </w:r>
+      <w:r>
+        <w:rPr>
+          <w:rFonts w:ascii="Times New Roman" w:hAnsi="Times New Roman" w:eastAsia="Times New Roman" w:cs="Times New Roman"/>
+          <w:noProof w:val="0"/>
+          <w:color w:val="000000" w:themeColor="text1" w:themeTint="FF" w:themeShade="FF"/>
+          <w:sz w:val="24"/>
+          <w:szCs w:val="24"/>
+          <w:lang w:val="en-US"/>
+        </w:rPr>
+        <w:t xml:space="preserve"> </w:t>
+      </w:r>
+      <w:r>
+        <w:rPr>
+          <w:rFonts w:ascii="Times New Roman" w:hAnsi="Times New Roman" w:eastAsia="Times New Roman" w:cs="Times New Roman"/>
+          <w:noProof w:val="0"/>
+          <w:color w:val="000000" w:themeColor="text1" w:themeTint="FF" w:themeShade="FF"/>
+          <w:sz w:val="24"/>
+          <w:szCs w:val="24"/>
+          <w:lang w:val="en-US"/>
+        </w:rPr>
+        <w:t>rekursi</w:t>
+      </w:r>
+      <w:r>
+        <w:rPr>
+          <w:rFonts w:ascii="Times New Roman" w:hAnsi="Times New Roman" w:eastAsia="Times New Roman" w:cs="Times New Roman"/>
+          <w:noProof w:val="0"/>
+          <w:color w:val="000000" w:themeColor="text1" w:themeTint="FF" w:themeShade="FF"/>
+          <w:sz w:val="24"/>
+          <w:szCs w:val="24"/>
+          <w:lang w:val="en-US"/>
+        </w:rPr>
+        <w:t xml:space="preserve">; </w:t>
+      </w:r>
+      <w:r>
+        <w:rPr>
+          <w:rFonts w:ascii="Times New Roman" w:hAnsi="Times New Roman" w:eastAsia="Times New Roman" w:cs="Times New Roman"/>
+          <w:noProof w:val="0"/>
+          <w:color w:val="000000" w:themeColor="text1" w:themeTint="FF" w:themeShade="FF"/>
+          <w:sz w:val="24"/>
+          <w:szCs w:val="24"/>
+          <w:lang w:val="en-US"/>
+        </w:rPr>
+        <w:t>keluaran</w:t>
+      </w:r>
+      <w:r>
+        <w:rPr>
+          <w:rFonts w:ascii="Times New Roman" w:hAnsi="Times New Roman" w:eastAsia="Times New Roman" w:cs="Times New Roman"/>
+          <w:noProof w:val="0"/>
+          <w:color w:val="000000" w:themeColor="text1" w:themeTint="FF" w:themeShade="FF"/>
+          <w:sz w:val="24"/>
+          <w:szCs w:val="24"/>
+          <w:lang w:val="en-US"/>
+        </w:rPr>
+        <w:t xml:space="preserve"> </w:t>
+      </w:r>
+      <w:r>
+        <w:rPr>
+          <w:rFonts w:ascii="Times New Roman" w:hAnsi="Times New Roman" w:eastAsia="Times New Roman" w:cs="Times New Roman"/>
+          <w:noProof w:val="0"/>
+          <w:color w:val="000000" w:themeColor="text1" w:themeTint="FF" w:themeShade="FF"/>
+          <w:sz w:val="24"/>
+          <w:szCs w:val="24"/>
+          <w:lang w:val="en-US"/>
+        </w:rPr>
+        <w:t>memakai</w:t>
+      </w:r>
+      <w:r>
+        <w:rPr>
+          <w:rFonts w:ascii="Times New Roman" w:hAnsi="Times New Roman" w:eastAsia="Times New Roman" w:cs="Times New Roman"/>
+          <w:noProof w:val="0"/>
+          <w:color w:val="000000" w:themeColor="text1" w:themeTint="FF" w:themeShade="FF"/>
+          <w:sz w:val="24"/>
+          <w:szCs w:val="24"/>
+          <w:lang w:val="en-US"/>
+        </w:rPr>
+        <w:t xml:space="preserve"> </w:t>
+      </w:r>
+      <w:r>
+        <w:rPr>
+          <w:rFonts w:ascii="Times New Roman" w:hAnsi="Times New Roman" w:eastAsia="Times New Roman" w:cs="Times New Roman"/>
+          <w:noProof w:val="0"/>
+          <w:color w:val="000000" w:themeColor="text1" w:themeTint="FF" w:themeShade="FF"/>
+          <w:sz w:val="24"/>
+          <w:szCs w:val="24"/>
+          <w:lang w:val="en-US"/>
+        </w:rPr>
+        <w:t>menit:detik</w:t>
+      </w:r>
+      <w:r>
+        <w:rPr>
+          <w:rFonts w:ascii="Times New Roman" w:hAnsi="Times New Roman" w:eastAsia="Times New Roman" w:cs="Times New Roman"/>
+          <w:noProof w:val="0"/>
+          <w:color w:val="000000" w:themeColor="text1" w:themeTint="FF" w:themeShade="FF"/>
+          <w:sz w:val="24"/>
+          <w:szCs w:val="24"/>
+          <w:lang w:val="en-US"/>
+        </w:rPr>
+        <w:t>.</w:t>
       </w:r>
     </w:p>
     <w:p>
@@ -7291,10 +8541,10 @@
       </w:pPr>
       <w:r>
         <w:drawing>
-          <wp:inline wp14:editId="5ADA1AD6" wp14:anchorId="5C89ED5D">
-            <wp:extent cx="5669280" cy="1197262"/>
+          <wp:inline wp14:editId="440EDA15" wp14:anchorId="3DEFE33E">
+            <wp:extent cx="5669280" cy="1193985"/>
             <wp:effectExtent l="0" t="0" r="0" b="0"/>
-            <wp:docPr id="1428024220" name="drawing"/>
+            <wp:docPr id="817044605" name="drawing"/>
             <wp:cNvGraphicFramePr>
               <a:graphicFrameLocks noChangeAspect="1"/>
             </wp:cNvGraphicFramePr>
@@ -7302,78 +8552,11 @@
               <a:graphicData xmlns:a="http://schemas.openxmlformats.org/drawingml/2006/main" uri="http://schemas.openxmlformats.org/drawingml/2006/picture">
                 <pic:pic xmlns:pic="http://schemas.openxmlformats.org/drawingml/2006/picture">
                   <pic:nvPicPr>
-                    <pic:cNvPr id="1428024220" name="Picture 1428024220"/>
+                    <pic:cNvPr id="817044605" name="Picture 817044605"/>
                     <pic:cNvPicPr/>
                   </pic:nvPicPr>
                   <pic:blipFill>
-                    <a:blip xmlns:r="http://schemas.openxmlformats.org/officeDocument/2006/relationships" r:embed="rId366395382">
-                      <a:extLst>
-                        <a:ext uri="{28A0092B-C50C-407E-A947-70E740481C1C}">
-                          <a14:useLocalDpi xmlns:a14="http://schemas.microsoft.com/office/drawing/2010/main"/>
-                        </a:ext>
-                      </a:extLst>
-                    </a:blip>
-                    <a:stretch>
-                      <a:fillRect/>
-                    </a:stretch>
-                  </pic:blipFill>
-                  <pic:spPr>
-                    <a:xfrm>
-                      <a:off x="0" y="0"/>
-                      <a:ext cx="5669280" cy="1197262"/>
-                    </a:xfrm>
-                    <a:prstGeom prst="rect">
-                      <a:avLst/>
-                    </a:prstGeom>
-                  </pic:spPr>
-                </pic:pic>
-              </a:graphicData>
-            </a:graphic>
-          </wp:inline>
-        </w:drawing>
-      </w:r>
-    </w:p>
-    <w:p>
-      <w:pPr>
-        <w:spacing w:before="0" w:beforeAutospacing="off" w:after="120" w:afterAutospacing="off" w:line="276" w:lineRule="auto"/>
-        <w:jc w:val="both"/>
-      </w:pPr>
-      <w:r>
-        <w:rPr>
-          <w:rFonts w:ascii="Times New Roman" w:hAnsi="Times New Roman" w:eastAsia="Times New Roman" w:cs="Times New Roman"/>
-          <w:noProof w:val="0"/>
-          <w:color w:val="000000" w:themeColor="text1" w:themeTint="FF" w:themeShade="FF"/>
-          <w:sz w:val="24"/>
-          <w:szCs w:val="24"/>
-          <w:lang w:val="en-US"/>
-        </w:rPr>
-        <w:t>Gambar 2. Hasil total durasi dan lagu dengan durasi terpanjang.</w:t>
-      </w:r>
-    </w:p>
-    <w:p>
-      <w:pPr>
-        <w:pStyle w:val="Normal"/>
-        <w:ind w:left="284"/>
-        <w:jc w:val="both"/>
-      </w:pPr>
-      <w:r>
-        <w:drawing>
-          <wp:inline wp14:editId="670FEADB" wp14:anchorId="3A51D84E">
-            <wp:extent cx="5669280" cy="2070033"/>
-            <wp:effectExtent l="0" t="0" r="0" b="0"/>
-            <wp:docPr id="1785495388" name="drawing"/>
-            <wp:cNvGraphicFramePr>
-              <a:graphicFrameLocks noChangeAspect="1"/>
-            </wp:cNvGraphicFramePr>
-            <a:graphic>
-              <a:graphicData xmlns:a="http://schemas.openxmlformats.org/drawingml/2006/main" uri="http://schemas.openxmlformats.org/drawingml/2006/picture">
-                <pic:pic xmlns:pic="http://schemas.openxmlformats.org/drawingml/2006/picture">
-                  <pic:nvPicPr>
-                    <pic:cNvPr id="1785495388" name="Picture 1785495388"/>
-                    <pic:cNvPicPr/>
-                  </pic:nvPicPr>
-                  <pic:blipFill>
-                    <a:blip xmlns:r="http://schemas.openxmlformats.org/officeDocument/2006/relationships" r:embed="rId807875673">
+                    <a:blip xmlns:r="http://schemas.openxmlformats.org/officeDocument/2006/relationships" r:embed="rId1177908728">
                       <a:extLst>
                         <a:ext uri="{28A0092B-C50C-407E-A947-70E740481C1C}">
                           <a14:useLocalDpi xmlns:a14="http://schemas.microsoft.com/office/drawing/2010/main"/>
@@ -7387,7 +8570,7 @@
                   <pic:spPr>
                     <a:xfrm rot="0">
                       <a:off x="0" y="0"/>
-                      <a:ext cx="5669280" cy="2070033"/>
+                      <a:ext cx="5669280" cy="1193985"/>
                     </a:xfrm>
                     <a:prstGeom prst="rect">
                       <a:avLst/>
@@ -7414,7 +8597,7 @@
           <w:szCs w:val="24"/>
           <w:lang w:val="en-US"/>
         </w:rPr>
-        <w:t>Gambar 3. Reverse traversal menghasilkan urutan lagu 10 sampai 1.</w:t>
+        <w:t>Gambar 2. Hasil total durasi dan lagu dengan durasi terpanjang.</w:t>
       </w:r>
     </w:p>
     <w:p>
@@ -7423,95 +8606,12 @@
         <w:ind w:left="284"/>
         <w:jc w:val="both"/>
       </w:pPr>
-    </w:p>
-    <w:p>
-      <w:pPr>
-        <w:pStyle w:val="Normal"/>
-        <w:keepNext w:val="1"/>
-        <w:pageBreakBefore w:val="1"/>
-      </w:pPr>
-      <w:r>
-        <w:rPr>
-          <w:rFonts w:ascii="Times New Roman" w:hAnsi="Times New Roman" w:eastAsia="Times New Roman" w:cs="Times New Roman"/>
-          <w:b w:val="1"/>
-          <w:bCs w:val="1"/>
-          <w:noProof w:val="0"/>
-          <w:color w:val="000000" w:themeColor="text1" w:themeTint="FF" w:themeShade="FF"/>
-          <w:sz w:val="24"/>
-          <w:szCs w:val="24"/>
-          <w:lang w:val="en-US"/>
-        </w:rPr>
-        <w:t xml:space="preserve">5. </w:t>
-      </w:r>
-      <w:r>
-        <w:rPr>
-          <w:rFonts w:ascii="Times New Roman" w:hAnsi="Times New Roman" w:eastAsia="Times New Roman" w:cs="Times New Roman"/>
-          <w:b w:val="1"/>
-          <w:bCs w:val="1"/>
-          <w:noProof w:val="0"/>
-          <w:color w:val="000000" w:themeColor="text1" w:themeTint="FF" w:themeShade="FF"/>
-          <w:sz w:val="24"/>
-          <w:szCs w:val="24"/>
-          <w:lang w:val="en-US"/>
-        </w:rPr>
-        <w:t>Verifikasi</w:t>
-      </w:r>
-      <w:r>
-        <w:rPr>
-          <w:rFonts w:ascii="Times New Roman" w:hAnsi="Times New Roman" w:eastAsia="Times New Roman" w:cs="Times New Roman"/>
-          <w:b w:val="1"/>
-          <w:bCs w:val="1"/>
-          <w:noProof w:val="0"/>
-          <w:color w:val="000000" w:themeColor="text1" w:themeTint="FF" w:themeShade="FF"/>
-          <w:sz w:val="24"/>
-          <w:szCs w:val="24"/>
-          <w:lang w:val="en-US"/>
-        </w:rPr>
-        <w:t xml:space="preserve"> dan </w:t>
-      </w:r>
-      <w:r>
-        <w:rPr>
-          <w:rFonts w:ascii="Times New Roman" w:hAnsi="Times New Roman" w:eastAsia="Times New Roman" w:cs="Times New Roman"/>
-          <w:b w:val="1"/>
-          <w:bCs w:val="1"/>
-          <w:noProof w:val="0"/>
-          <w:color w:val="000000" w:themeColor="text1" w:themeTint="FF" w:themeShade="FF"/>
-          <w:sz w:val="24"/>
-          <w:szCs w:val="24"/>
-          <w:lang w:val="en-US"/>
-        </w:rPr>
-        <w:t>Reproduksi</w:t>
-      </w:r>
-    </w:p>
-    <w:p>
-      <w:pPr>
-        <w:spacing w:before="0" w:beforeAutospacing="off" w:after="120" w:afterAutospacing="off" w:line="276" w:lineRule="auto"/>
-        <w:jc w:val="both"/>
-      </w:pPr>
-      <w:r>
-        <w:rPr>
-          <w:rFonts w:ascii="Times New Roman" w:hAnsi="Times New Roman" w:eastAsia="Times New Roman" w:cs="Times New Roman"/>
-          <w:noProof w:val="0"/>
-          <w:color w:val="000000" w:themeColor="text1" w:themeTint="FF" w:themeShade="FF"/>
-          <w:sz w:val="24"/>
-          <w:szCs w:val="24"/>
-          <w:lang w:val="en-US"/>
-        </w:rPr>
-        <w:t>Pengujian membandingkan total dan maksimum dengan acuan detik yang dihitung terpisah, serta memeriksa urutan traversal. Ukuran yang diuji adalah 0, 1, 2, 3, 4, 5, 6, 8, dan 10 lagu. Kasus tambahan mencakup durasi sama, perpindahan 60 detik, nol di depan detik, dan masukan tidak valid. Seluruh 77 pemeriksaan lulus.</w:t>
-      </w:r>
-    </w:p>
-    <w:p>
-      <w:pPr>
-        <w:pStyle w:val="Normal"/>
-        <w:ind w:left="284"/>
-        <w:jc w:val="both"/>
-      </w:pPr>
       <w:r>
         <w:drawing>
-          <wp:inline wp14:editId="084D9AAE" wp14:anchorId="7557C96A">
-            <wp:extent cx="5669280" cy="1488186"/>
+          <wp:inline wp14:editId="66D53198" wp14:anchorId="0EC71D19">
+            <wp:extent cx="5669280" cy="2070146"/>
             <wp:effectExtent l="0" t="0" r="0" b="0"/>
-            <wp:docPr id="900030634" name="drawing"/>
+            <wp:docPr id="305528910" name="drawing"/>
             <wp:cNvGraphicFramePr>
               <a:graphicFrameLocks noChangeAspect="1"/>
             </wp:cNvGraphicFramePr>
@@ -7519,11 +8619,11 @@
               <a:graphicData xmlns:a="http://schemas.openxmlformats.org/drawingml/2006/main" uri="http://schemas.openxmlformats.org/drawingml/2006/picture">
                 <pic:pic xmlns:pic="http://schemas.openxmlformats.org/drawingml/2006/picture">
                   <pic:nvPicPr>
-                    <pic:cNvPr id="900030634" name="Picture 900030634"/>
+                    <pic:cNvPr id="305528910" name="Picture 305528910"/>
                     <pic:cNvPicPr/>
                   </pic:nvPicPr>
                   <pic:blipFill>
-                    <a:blip xmlns:r="http://schemas.openxmlformats.org/officeDocument/2006/relationships" r:embed="rId1377406912">
+                    <a:blip xmlns:r="http://schemas.openxmlformats.org/officeDocument/2006/relationships" r:embed="rId1116140527">
                       <a:extLst>
                         <a:ext uri="{28A0092B-C50C-407E-A947-70E740481C1C}">
                           <a14:useLocalDpi xmlns:a14="http://schemas.microsoft.com/office/drawing/2010/main"/>
@@ -7535,9 +8635,9 @@
                     </a:stretch>
                   </pic:blipFill>
                   <pic:spPr>
-                    <a:xfrm>
+                    <a:xfrm rot="0">
                       <a:off x="0" y="0"/>
-                      <a:ext cx="5669280" cy="1488186"/>
+                      <a:ext cx="5669280" cy="2070146"/>
                     </a:xfrm>
                     <a:prstGeom prst="rect">
                       <a:avLst/>
@@ -7564,11 +8664,755 @@
           <w:szCs w:val="24"/>
           <w:lang w:val="en-US"/>
         </w:rPr>
-        <w:t>Gambar 4. Pengukuran waktu aktual pada salinan program sesuai instruksi.</w:t>
+        <w:t>Gambar 3. Reverse traversal menghasilkan urutan lagu 10 sampai 1.</w:t>
       </w:r>
     </w:p>
     <w:p>
       <w:pPr>
+        <w:pStyle w:val="Normal"/>
+        <w:ind w:left="284"/>
+        <w:jc w:val="both"/>
+      </w:pPr>
+    </w:p>
+    <w:p>
+      <w:pPr>
+        <w:pStyle w:val="Normal"/>
+        <w:keepNext w:val="1"/>
+        <w:pageBreakBefore w:val="1"/>
+      </w:pPr>
+      <w:r>
+        <w:rPr>
+          <w:rFonts w:ascii="Times New Roman" w:hAnsi="Times New Roman" w:eastAsia="Times New Roman" w:cs="Times New Roman"/>
+          <w:b w:val="1"/>
+          <w:bCs w:val="1"/>
+          <w:noProof w:val="0"/>
+          <w:color w:val="000000" w:themeColor="text1" w:themeTint="FF" w:themeShade="FF"/>
+          <w:sz w:val="24"/>
+          <w:szCs w:val="24"/>
+          <w:lang w:val="en-US"/>
+        </w:rPr>
+        <w:t xml:space="preserve">5. </w:t>
+      </w:r>
+      <w:r>
+        <w:rPr>
+          <w:rFonts w:ascii="Times New Roman" w:hAnsi="Times New Roman" w:eastAsia="Times New Roman" w:cs="Times New Roman"/>
+          <w:b w:val="1"/>
+          <w:bCs w:val="1"/>
+          <w:noProof w:val="0"/>
+          <w:color w:val="000000" w:themeColor="text1" w:themeTint="FF" w:themeShade="FF"/>
+          <w:sz w:val="24"/>
+          <w:szCs w:val="24"/>
+          <w:lang w:val="en-US"/>
+        </w:rPr>
+        <w:t>Verifikasi</w:t>
+      </w:r>
+      <w:r>
+        <w:rPr>
+          <w:rFonts w:ascii="Times New Roman" w:hAnsi="Times New Roman" w:eastAsia="Times New Roman" w:cs="Times New Roman"/>
+          <w:b w:val="1"/>
+          <w:bCs w:val="1"/>
+          <w:noProof w:val="0"/>
+          <w:color w:val="000000" w:themeColor="text1" w:themeTint="FF" w:themeShade="FF"/>
+          <w:sz w:val="24"/>
+          <w:szCs w:val="24"/>
+          <w:lang w:val="en-US"/>
+        </w:rPr>
+        <w:t xml:space="preserve"> dan </w:t>
+      </w:r>
+      <w:r>
+        <w:rPr>
+          <w:rFonts w:ascii="Times New Roman" w:hAnsi="Times New Roman" w:eastAsia="Times New Roman" w:cs="Times New Roman"/>
+          <w:b w:val="1"/>
+          <w:bCs w:val="1"/>
+          <w:noProof w:val="0"/>
+          <w:color w:val="000000" w:themeColor="text1" w:themeTint="FF" w:themeShade="FF"/>
+          <w:sz w:val="24"/>
+          <w:szCs w:val="24"/>
+          <w:lang w:val="en-US"/>
+        </w:rPr>
+        <w:t>Reproduksi</w:t>
+      </w:r>
+    </w:p>
+    <w:p>
+      <w:pPr>
+        <w:spacing w:before="0" w:beforeAutospacing="off" w:after="120" w:afterAutospacing="off" w:line="276" w:lineRule="auto"/>
+        <w:jc w:val="both"/>
+      </w:pPr>
+      <w:r>
+        <w:rPr>
+          <w:rFonts w:ascii="Times New Roman" w:hAnsi="Times New Roman" w:eastAsia="Times New Roman" w:cs="Times New Roman"/>
+          <w:noProof w:val="0"/>
+          <w:color w:val="000000" w:themeColor="text1" w:themeTint="FF" w:themeShade="FF"/>
+          <w:sz w:val="24"/>
+          <w:szCs w:val="24"/>
+          <w:lang w:val="en-US"/>
+        </w:rPr>
+        <w:t>Pengujian</w:t>
+      </w:r>
+      <w:r>
+        <w:rPr>
+          <w:rFonts w:ascii="Times New Roman" w:hAnsi="Times New Roman" w:eastAsia="Times New Roman" w:cs="Times New Roman"/>
+          <w:noProof w:val="0"/>
+          <w:color w:val="000000" w:themeColor="text1" w:themeTint="FF" w:themeShade="FF"/>
+          <w:sz w:val="24"/>
+          <w:szCs w:val="24"/>
+          <w:lang w:val="en-US"/>
+        </w:rPr>
+        <w:t xml:space="preserve"> </w:t>
+      </w:r>
+      <w:r>
+        <w:rPr>
+          <w:rFonts w:ascii="Times New Roman" w:hAnsi="Times New Roman" w:eastAsia="Times New Roman" w:cs="Times New Roman"/>
+          <w:noProof w:val="0"/>
+          <w:color w:val="000000" w:themeColor="text1" w:themeTint="FF" w:themeShade="FF"/>
+          <w:sz w:val="24"/>
+          <w:szCs w:val="24"/>
+          <w:lang w:val="en-US"/>
+        </w:rPr>
+        <w:t>membandingkan</w:t>
+      </w:r>
+      <w:r>
+        <w:rPr>
+          <w:rFonts w:ascii="Times New Roman" w:hAnsi="Times New Roman" w:eastAsia="Times New Roman" w:cs="Times New Roman"/>
+          <w:noProof w:val="0"/>
+          <w:color w:val="000000" w:themeColor="text1" w:themeTint="FF" w:themeShade="FF"/>
+          <w:sz w:val="24"/>
+          <w:szCs w:val="24"/>
+          <w:lang w:val="en-US"/>
+        </w:rPr>
+        <w:t xml:space="preserve"> total dan </w:t>
+      </w:r>
+      <w:r>
+        <w:rPr>
+          <w:rFonts w:ascii="Times New Roman" w:hAnsi="Times New Roman" w:eastAsia="Times New Roman" w:cs="Times New Roman"/>
+          <w:noProof w:val="0"/>
+          <w:color w:val="000000" w:themeColor="text1" w:themeTint="FF" w:themeShade="FF"/>
+          <w:sz w:val="24"/>
+          <w:szCs w:val="24"/>
+          <w:lang w:val="en-US"/>
+        </w:rPr>
+        <w:t>maksimum</w:t>
+      </w:r>
+      <w:r>
+        <w:rPr>
+          <w:rFonts w:ascii="Times New Roman" w:hAnsi="Times New Roman" w:eastAsia="Times New Roman" w:cs="Times New Roman"/>
+          <w:noProof w:val="0"/>
+          <w:color w:val="000000" w:themeColor="text1" w:themeTint="FF" w:themeShade="FF"/>
+          <w:sz w:val="24"/>
+          <w:szCs w:val="24"/>
+          <w:lang w:val="en-US"/>
+        </w:rPr>
+        <w:t xml:space="preserve"> </w:t>
+      </w:r>
+      <w:r>
+        <w:rPr>
+          <w:rFonts w:ascii="Times New Roman" w:hAnsi="Times New Roman" w:eastAsia="Times New Roman" w:cs="Times New Roman"/>
+          <w:noProof w:val="0"/>
+          <w:color w:val="000000" w:themeColor="text1" w:themeTint="FF" w:themeShade="FF"/>
+          <w:sz w:val="24"/>
+          <w:szCs w:val="24"/>
+          <w:lang w:val="en-US"/>
+        </w:rPr>
+        <w:t>dengan</w:t>
+      </w:r>
+      <w:r>
+        <w:rPr>
+          <w:rFonts w:ascii="Times New Roman" w:hAnsi="Times New Roman" w:eastAsia="Times New Roman" w:cs="Times New Roman"/>
+          <w:noProof w:val="0"/>
+          <w:color w:val="000000" w:themeColor="text1" w:themeTint="FF" w:themeShade="FF"/>
+          <w:sz w:val="24"/>
+          <w:szCs w:val="24"/>
+          <w:lang w:val="en-US"/>
+        </w:rPr>
+        <w:t xml:space="preserve"> </w:t>
+      </w:r>
+      <w:r>
+        <w:rPr>
+          <w:rFonts w:ascii="Times New Roman" w:hAnsi="Times New Roman" w:eastAsia="Times New Roman" w:cs="Times New Roman"/>
+          <w:noProof w:val="0"/>
+          <w:color w:val="000000" w:themeColor="text1" w:themeTint="FF" w:themeShade="FF"/>
+          <w:sz w:val="24"/>
+          <w:szCs w:val="24"/>
+          <w:lang w:val="en-US"/>
+        </w:rPr>
+        <w:t>acuan</w:t>
+      </w:r>
+      <w:r>
+        <w:rPr>
+          <w:rFonts w:ascii="Times New Roman" w:hAnsi="Times New Roman" w:eastAsia="Times New Roman" w:cs="Times New Roman"/>
+          <w:noProof w:val="0"/>
+          <w:color w:val="000000" w:themeColor="text1" w:themeTint="FF" w:themeShade="FF"/>
+          <w:sz w:val="24"/>
+          <w:szCs w:val="24"/>
+          <w:lang w:val="en-US"/>
+        </w:rPr>
+        <w:t xml:space="preserve"> </w:t>
+      </w:r>
+      <w:r>
+        <w:rPr>
+          <w:rFonts w:ascii="Times New Roman" w:hAnsi="Times New Roman" w:eastAsia="Times New Roman" w:cs="Times New Roman"/>
+          <w:noProof w:val="0"/>
+          <w:color w:val="000000" w:themeColor="text1" w:themeTint="FF" w:themeShade="FF"/>
+          <w:sz w:val="24"/>
+          <w:szCs w:val="24"/>
+          <w:lang w:val="en-US"/>
+        </w:rPr>
+        <w:t>detik</w:t>
+      </w:r>
+      <w:r>
+        <w:rPr>
+          <w:rFonts w:ascii="Times New Roman" w:hAnsi="Times New Roman" w:eastAsia="Times New Roman" w:cs="Times New Roman"/>
+          <w:noProof w:val="0"/>
+          <w:color w:val="000000" w:themeColor="text1" w:themeTint="FF" w:themeShade="FF"/>
+          <w:sz w:val="24"/>
+          <w:szCs w:val="24"/>
+          <w:lang w:val="en-US"/>
+        </w:rPr>
+        <w:t xml:space="preserve"> yang </w:t>
+      </w:r>
+      <w:r>
+        <w:rPr>
+          <w:rFonts w:ascii="Times New Roman" w:hAnsi="Times New Roman" w:eastAsia="Times New Roman" w:cs="Times New Roman"/>
+          <w:noProof w:val="0"/>
+          <w:color w:val="000000" w:themeColor="text1" w:themeTint="FF" w:themeShade="FF"/>
+          <w:sz w:val="24"/>
+          <w:szCs w:val="24"/>
+          <w:lang w:val="en-US"/>
+        </w:rPr>
+        <w:t>dihitung</w:t>
+      </w:r>
+      <w:r>
+        <w:rPr>
+          <w:rFonts w:ascii="Times New Roman" w:hAnsi="Times New Roman" w:eastAsia="Times New Roman" w:cs="Times New Roman"/>
+          <w:noProof w:val="0"/>
+          <w:color w:val="000000" w:themeColor="text1" w:themeTint="FF" w:themeShade="FF"/>
+          <w:sz w:val="24"/>
+          <w:szCs w:val="24"/>
+          <w:lang w:val="en-US"/>
+        </w:rPr>
+        <w:t xml:space="preserve"> </w:t>
+      </w:r>
+      <w:r>
+        <w:rPr>
+          <w:rFonts w:ascii="Times New Roman" w:hAnsi="Times New Roman" w:eastAsia="Times New Roman" w:cs="Times New Roman"/>
+          <w:noProof w:val="0"/>
+          <w:color w:val="000000" w:themeColor="text1" w:themeTint="FF" w:themeShade="FF"/>
+          <w:sz w:val="24"/>
+          <w:szCs w:val="24"/>
+          <w:lang w:val="en-US"/>
+        </w:rPr>
+        <w:t>terpisah</w:t>
+      </w:r>
+      <w:r>
+        <w:rPr>
+          <w:rFonts w:ascii="Times New Roman" w:hAnsi="Times New Roman" w:eastAsia="Times New Roman" w:cs="Times New Roman"/>
+          <w:noProof w:val="0"/>
+          <w:color w:val="000000" w:themeColor="text1" w:themeTint="FF" w:themeShade="FF"/>
+          <w:sz w:val="24"/>
+          <w:szCs w:val="24"/>
+          <w:lang w:val="en-US"/>
+        </w:rPr>
+        <w:t xml:space="preserve">, </w:t>
+      </w:r>
+      <w:r>
+        <w:rPr>
+          <w:rFonts w:ascii="Times New Roman" w:hAnsi="Times New Roman" w:eastAsia="Times New Roman" w:cs="Times New Roman"/>
+          <w:noProof w:val="0"/>
+          <w:color w:val="000000" w:themeColor="text1" w:themeTint="FF" w:themeShade="FF"/>
+          <w:sz w:val="24"/>
+          <w:szCs w:val="24"/>
+          <w:lang w:val="en-US"/>
+        </w:rPr>
+        <w:t>serta</w:t>
+      </w:r>
+      <w:r>
+        <w:rPr>
+          <w:rFonts w:ascii="Times New Roman" w:hAnsi="Times New Roman" w:eastAsia="Times New Roman" w:cs="Times New Roman"/>
+          <w:noProof w:val="0"/>
+          <w:color w:val="000000" w:themeColor="text1" w:themeTint="FF" w:themeShade="FF"/>
+          <w:sz w:val="24"/>
+          <w:szCs w:val="24"/>
+          <w:lang w:val="en-US"/>
+        </w:rPr>
+        <w:t xml:space="preserve"> </w:t>
+      </w:r>
+      <w:r>
+        <w:rPr>
+          <w:rFonts w:ascii="Times New Roman" w:hAnsi="Times New Roman" w:eastAsia="Times New Roman" w:cs="Times New Roman"/>
+          <w:noProof w:val="0"/>
+          <w:color w:val="000000" w:themeColor="text1" w:themeTint="FF" w:themeShade="FF"/>
+          <w:sz w:val="24"/>
+          <w:szCs w:val="24"/>
+          <w:lang w:val="en-US"/>
+        </w:rPr>
+        <w:t>memeriksa</w:t>
+      </w:r>
+      <w:r>
+        <w:rPr>
+          <w:rFonts w:ascii="Times New Roman" w:hAnsi="Times New Roman" w:eastAsia="Times New Roman" w:cs="Times New Roman"/>
+          <w:noProof w:val="0"/>
+          <w:color w:val="000000" w:themeColor="text1" w:themeTint="FF" w:themeShade="FF"/>
+          <w:sz w:val="24"/>
+          <w:szCs w:val="24"/>
+          <w:lang w:val="en-US"/>
+        </w:rPr>
+        <w:t xml:space="preserve"> </w:t>
+      </w:r>
+      <w:r>
+        <w:rPr>
+          <w:rFonts w:ascii="Times New Roman" w:hAnsi="Times New Roman" w:eastAsia="Times New Roman" w:cs="Times New Roman"/>
+          <w:noProof w:val="0"/>
+          <w:color w:val="000000" w:themeColor="text1" w:themeTint="FF" w:themeShade="FF"/>
+          <w:sz w:val="24"/>
+          <w:szCs w:val="24"/>
+          <w:lang w:val="en-US"/>
+        </w:rPr>
+        <w:t>urutan</w:t>
+      </w:r>
+      <w:r>
+        <w:rPr>
+          <w:rFonts w:ascii="Times New Roman" w:hAnsi="Times New Roman" w:eastAsia="Times New Roman" w:cs="Times New Roman"/>
+          <w:noProof w:val="0"/>
+          <w:color w:val="000000" w:themeColor="text1" w:themeTint="FF" w:themeShade="FF"/>
+          <w:sz w:val="24"/>
+          <w:szCs w:val="24"/>
+          <w:lang w:val="en-US"/>
+        </w:rPr>
+        <w:t xml:space="preserve"> traversal.</w:t>
+      </w:r>
+      <w:r>
+        <w:rPr>
+          <w:rFonts w:ascii="Times New Roman" w:hAnsi="Times New Roman" w:eastAsia="Times New Roman" w:cs="Times New Roman"/>
+          <w:noProof w:val="0"/>
+          <w:color w:val="000000" w:themeColor="text1" w:themeTint="FF" w:themeShade="FF"/>
+          <w:sz w:val="24"/>
+          <w:szCs w:val="24"/>
+          <w:lang w:val="en-US"/>
+        </w:rPr>
+        <w:t xml:space="preserve"> </w:t>
+      </w:r>
+      <w:r>
+        <w:rPr>
+          <w:rFonts w:ascii="Times New Roman" w:hAnsi="Times New Roman" w:eastAsia="Times New Roman" w:cs="Times New Roman"/>
+          <w:noProof w:val="0"/>
+          <w:color w:val="000000" w:themeColor="text1" w:themeTint="FF" w:themeShade="FF"/>
+          <w:sz w:val="24"/>
+          <w:szCs w:val="24"/>
+          <w:lang w:val="en-US"/>
+        </w:rPr>
+        <w:t xml:space="preserve">Ukuran yang diuji adalah 0, 1, 2, 3, 4, 5, 6, 8, dan 10 </w:t>
+      </w:r>
+      <w:r>
+        <w:rPr>
+          <w:rFonts w:ascii="Times New Roman" w:hAnsi="Times New Roman" w:eastAsia="Times New Roman" w:cs="Times New Roman"/>
+          <w:noProof w:val="0"/>
+          <w:color w:val="000000" w:themeColor="text1" w:themeTint="FF" w:themeShade="FF"/>
+          <w:sz w:val="24"/>
+          <w:szCs w:val="24"/>
+          <w:lang w:val="en-US"/>
+        </w:rPr>
+        <w:t>lagu</w:t>
+      </w:r>
+      <w:r>
+        <w:rPr>
+          <w:rFonts w:ascii="Times New Roman" w:hAnsi="Times New Roman" w:eastAsia="Times New Roman" w:cs="Times New Roman"/>
+          <w:noProof w:val="0"/>
+          <w:color w:val="000000" w:themeColor="text1" w:themeTint="FF" w:themeShade="FF"/>
+          <w:sz w:val="24"/>
+          <w:szCs w:val="24"/>
+          <w:lang w:val="en-US"/>
+        </w:rPr>
+        <w:t xml:space="preserve">. </w:t>
+      </w:r>
+      <w:r>
+        <w:rPr>
+          <w:rFonts w:ascii="Times New Roman" w:hAnsi="Times New Roman" w:eastAsia="Times New Roman" w:cs="Times New Roman"/>
+          <w:noProof w:val="0"/>
+          <w:color w:val="000000" w:themeColor="text1" w:themeTint="FF" w:themeShade="FF"/>
+          <w:sz w:val="24"/>
+          <w:szCs w:val="24"/>
+          <w:lang w:val="en-US"/>
+        </w:rPr>
+        <w:t>Kasus</w:t>
+      </w:r>
+      <w:r>
+        <w:rPr>
+          <w:rFonts w:ascii="Times New Roman" w:hAnsi="Times New Roman" w:eastAsia="Times New Roman" w:cs="Times New Roman"/>
+          <w:noProof w:val="0"/>
+          <w:color w:val="000000" w:themeColor="text1" w:themeTint="FF" w:themeShade="FF"/>
+          <w:sz w:val="24"/>
+          <w:szCs w:val="24"/>
+          <w:lang w:val="en-US"/>
+        </w:rPr>
+        <w:t xml:space="preserve"> </w:t>
+      </w:r>
+      <w:r>
+        <w:rPr>
+          <w:rFonts w:ascii="Times New Roman" w:hAnsi="Times New Roman" w:eastAsia="Times New Roman" w:cs="Times New Roman"/>
+          <w:noProof w:val="0"/>
+          <w:color w:val="000000" w:themeColor="text1" w:themeTint="FF" w:themeShade="FF"/>
+          <w:sz w:val="24"/>
+          <w:szCs w:val="24"/>
+          <w:lang w:val="en-US"/>
+        </w:rPr>
+        <w:t>tambahan</w:t>
+      </w:r>
+      <w:r>
+        <w:rPr>
+          <w:rFonts w:ascii="Times New Roman" w:hAnsi="Times New Roman" w:eastAsia="Times New Roman" w:cs="Times New Roman"/>
+          <w:noProof w:val="0"/>
+          <w:color w:val="000000" w:themeColor="text1" w:themeTint="FF" w:themeShade="FF"/>
+          <w:sz w:val="24"/>
+          <w:szCs w:val="24"/>
+          <w:lang w:val="en-US"/>
+        </w:rPr>
+        <w:t xml:space="preserve"> </w:t>
+      </w:r>
+      <w:r>
+        <w:rPr>
+          <w:rFonts w:ascii="Times New Roman" w:hAnsi="Times New Roman" w:eastAsia="Times New Roman" w:cs="Times New Roman"/>
+          <w:noProof w:val="0"/>
+          <w:color w:val="000000" w:themeColor="text1" w:themeTint="FF" w:themeShade="FF"/>
+          <w:sz w:val="24"/>
+          <w:szCs w:val="24"/>
+          <w:lang w:val="en-US"/>
+        </w:rPr>
+        <w:t>mencakup</w:t>
+      </w:r>
+      <w:r>
+        <w:rPr>
+          <w:rFonts w:ascii="Times New Roman" w:hAnsi="Times New Roman" w:eastAsia="Times New Roman" w:cs="Times New Roman"/>
+          <w:noProof w:val="0"/>
+          <w:color w:val="000000" w:themeColor="text1" w:themeTint="FF" w:themeShade="FF"/>
+          <w:sz w:val="24"/>
+          <w:szCs w:val="24"/>
+          <w:lang w:val="en-US"/>
+        </w:rPr>
+        <w:t xml:space="preserve"> </w:t>
+      </w:r>
+      <w:r>
+        <w:rPr>
+          <w:rFonts w:ascii="Times New Roman" w:hAnsi="Times New Roman" w:eastAsia="Times New Roman" w:cs="Times New Roman"/>
+          <w:noProof w:val="0"/>
+          <w:color w:val="000000" w:themeColor="text1" w:themeTint="FF" w:themeShade="FF"/>
+          <w:sz w:val="24"/>
+          <w:szCs w:val="24"/>
+          <w:lang w:val="en-US"/>
+        </w:rPr>
+        <w:t>durasi</w:t>
+      </w:r>
+      <w:r>
+        <w:rPr>
+          <w:rFonts w:ascii="Times New Roman" w:hAnsi="Times New Roman" w:eastAsia="Times New Roman" w:cs="Times New Roman"/>
+          <w:noProof w:val="0"/>
+          <w:color w:val="000000" w:themeColor="text1" w:themeTint="FF" w:themeShade="FF"/>
+          <w:sz w:val="24"/>
+          <w:szCs w:val="24"/>
+          <w:lang w:val="en-US"/>
+        </w:rPr>
+        <w:t xml:space="preserve"> </w:t>
+      </w:r>
+      <w:r>
+        <w:rPr>
+          <w:rFonts w:ascii="Times New Roman" w:hAnsi="Times New Roman" w:eastAsia="Times New Roman" w:cs="Times New Roman"/>
+          <w:noProof w:val="0"/>
+          <w:color w:val="000000" w:themeColor="text1" w:themeTint="FF" w:themeShade="FF"/>
+          <w:sz w:val="24"/>
+          <w:szCs w:val="24"/>
+          <w:lang w:val="en-US"/>
+        </w:rPr>
+        <w:t>sama</w:t>
+      </w:r>
+      <w:r>
+        <w:rPr>
+          <w:rFonts w:ascii="Times New Roman" w:hAnsi="Times New Roman" w:eastAsia="Times New Roman" w:cs="Times New Roman"/>
+          <w:noProof w:val="0"/>
+          <w:color w:val="000000" w:themeColor="text1" w:themeTint="FF" w:themeShade="FF"/>
+          <w:sz w:val="24"/>
+          <w:szCs w:val="24"/>
+          <w:lang w:val="en-US"/>
+        </w:rPr>
+        <w:t xml:space="preserve">, </w:t>
+      </w:r>
+      <w:r>
+        <w:rPr>
+          <w:rFonts w:ascii="Times New Roman" w:hAnsi="Times New Roman" w:eastAsia="Times New Roman" w:cs="Times New Roman"/>
+          <w:noProof w:val="0"/>
+          <w:color w:val="000000" w:themeColor="text1" w:themeTint="FF" w:themeShade="FF"/>
+          <w:sz w:val="24"/>
+          <w:szCs w:val="24"/>
+          <w:lang w:val="en-US"/>
+        </w:rPr>
+        <w:t>perpindahan</w:t>
+      </w:r>
+      <w:r>
+        <w:rPr>
+          <w:rFonts w:ascii="Times New Roman" w:hAnsi="Times New Roman" w:eastAsia="Times New Roman" w:cs="Times New Roman"/>
+          <w:noProof w:val="0"/>
+          <w:color w:val="000000" w:themeColor="text1" w:themeTint="FF" w:themeShade="FF"/>
+          <w:sz w:val="24"/>
+          <w:szCs w:val="24"/>
+          <w:lang w:val="en-US"/>
+        </w:rPr>
+        <w:t xml:space="preserve"> 60 </w:t>
+      </w:r>
+      <w:r>
+        <w:rPr>
+          <w:rFonts w:ascii="Times New Roman" w:hAnsi="Times New Roman" w:eastAsia="Times New Roman" w:cs="Times New Roman"/>
+          <w:noProof w:val="0"/>
+          <w:color w:val="000000" w:themeColor="text1" w:themeTint="FF" w:themeShade="FF"/>
+          <w:sz w:val="24"/>
+          <w:szCs w:val="24"/>
+          <w:lang w:val="en-US"/>
+        </w:rPr>
+        <w:t>detik</w:t>
+      </w:r>
+      <w:r>
+        <w:rPr>
+          <w:rFonts w:ascii="Times New Roman" w:hAnsi="Times New Roman" w:eastAsia="Times New Roman" w:cs="Times New Roman"/>
+          <w:noProof w:val="0"/>
+          <w:color w:val="000000" w:themeColor="text1" w:themeTint="FF" w:themeShade="FF"/>
+          <w:sz w:val="24"/>
+          <w:szCs w:val="24"/>
+          <w:lang w:val="en-US"/>
+        </w:rPr>
+        <w:t xml:space="preserve">, </w:t>
+      </w:r>
+      <w:r>
+        <w:rPr>
+          <w:rFonts w:ascii="Times New Roman" w:hAnsi="Times New Roman" w:eastAsia="Times New Roman" w:cs="Times New Roman"/>
+          <w:noProof w:val="0"/>
+          <w:color w:val="000000" w:themeColor="text1" w:themeTint="FF" w:themeShade="FF"/>
+          <w:sz w:val="24"/>
+          <w:szCs w:val="24"/>
+          <w:lang w:val="en-US"/>
+        </w:rPr>
+        <w:t>nol</w:t>
+      </w:r>
+      <w:r>
+        <w:rPr>
+          <w:rFonts w:ascii="Times New Roman" w:hAnsi="Times New Roman" w:eastAsia="Times New Roman" w:cs="Times New Roman"/>
+          <w:noProof w:val="0"/>
+          <w:color w:val="000000" w:themeColor="text1" w:themeTint="FF" w:themeShade="FF"/>
+          <w:sz w:val="24"/>
+          <w:szCs w:val="24"/>
+          <w:lang w:val="en-US"/>
+        </w:rPr>
+        <w:t xml:space="preserve"> di </w:t>
+      </w:r>
+      <w:r>
+        <w:rPr>
+          <w:rFonts w:ascii="Times New Roman" w:hAnsi="Times New Roman" w:eastAsia="Times New Roman" w:cs="Times New Roman"/>
+          <w:noProof w:val="0"/>
+          <w:color w:val="000000" w:themeColor="text1" w:themeTint="FF" w:themeShade="FF"/>
+          <w:sz w:val="24"/>
+          <w:szCs w:val="24"/>
+          <w:lang w:val="en-US"/>
+        </w:rPr>
+        <w:t>depan</w:t>
+      </w:r>
+      <w:r>
+        <w:rPr>
+          <w:rFonts w:ascii="Times New Roman" w:hAnsi="Times New Roman" w:eastAsia="Times New Roman" w:cs="Times New Roman"/>
+          <w:noProof w:val="0"/>
+          <w:color w:val="000000" w:themeColor="text1" w:themeTint="FF" w:themeShade="FF"/>
+          <w:sz w:val="24"/>
+          <w:szCs w:val="24"/>
+          <w:lang w:val="en-US"/>
+        </w:rPr>
+        <w:t xml:space="preserve"> </w:t>
+      </w:r>
+      <w:r>
+        <w:rPr>
+          <w:rFonts w:ascii="Times New Roman" w:hAnsi="Times New Roman" w:eastAsia="Times New Roman" w:cs="Times New Roman"/>
+          <w:noProof w:val="0"/>
+          <w:color w:val="000000" w:themeColor="text1" w:themeTint="FF" w:themeShade="FF"/>
+          <w:sz w:val="24"/>
+          <w:szCs w:val="24"/>
+          <w:lang w:val="en-US"/>
+        </w:rPr>
+        <w:t>detik</w:t>
+      </w:r>
+      <w:r>
+        <w:rPr>
+          <w:rFonts w:ascii="Times New Roman" w:hAnsi="Times New Roman" w:eastAsia="Times New Roman" w:cs="Times New Roman"/>
+          <w:noProof w:val="0"/>
+          <w:color w:val="000000" w:themeColor="text1" w:themeTint="FF" w:themeShade="FF"/>
+          <w:sz w:val="24"/>
+          <w:szCs w:val="24"/>
+          <w:lang w:val="en-US"/>
+        </w:rPr>
+        <w:t xml:space="preserve">, dan </w:t>
+      </w:r>
+      <w:r>
+        <w:rPr>
+          <w:rFonts w:ascii="Times New Roman" w:hAnsi="Times New Roman" w:eastAsia="Times New Roman" w:cs="Times New Roman"/>
+          <w:noProof w:val="0"/>
+          <w:color w:val="000000" w:themeColor="text1" w:themeTint="FF" w:themeShade="FF"/>
+          <w:sz w:val="24"/>
+          <w:szCs w:val="24"/>
+          <w:lang w:val="en-US"/>
+        </w:rPr>
+        <w:t>masukan</w:t>
+      </w:r>
+      <w:r>
+        <w:rPr>
+          <w:rFonts w:ascii="Times New Roman" w:hAnsi="Times New Roman" w:eastAsia="Times New Roman" w:cs="Times New Roman"/>
+          <w:noProof w:val="0"/>
+          <w:color w:val="000000" w:themeColor="text1" w:themeTint="FF" w:themeShade="FF"/>
+          <w:sz w:val="24"/>
+          <w:szCs w:val="24"/>
+          <w:lang w:val="en-US"/>
+        </w:rPr>
+        <w:t xml:space="preserve"> </w:t>
+      </w:r>
+      <w:r>
+        <w:rPr>
+          <w:rFonts w:ascii="Times New Roman" w:hAnsi="Times New Roman" w:eastAsia="Times New Roman" w:cs="Times New Roman"/>
+          <w:noProof w:val="0"/>
+          <w:color w:val="000000" w:themeColor="text1" w:themeTint="FF" w:themeShade="FF"/>
+          <w:sz w:val="24"/>
+          <w:szCs w:val="24"/>
+          <w:lang w:val="en-US"/>
+        </w:rPr>
+        <w:t>tidak</w:t>
+      </w:r>
+      <w:r>
+        <w:rPr>
+          <w:rFonts w:ascii="Times New Roman" w:hAnsi="Times New Roman" w:eastAsia="Times New Roman" w:cs="Times New Roman"/>
+          <w:noProof w:val="0"/>
+          <w:color w:val="000000" w:themeColor="text1" w:themeTint="FF" w:themeShade="FF"/>
+          <w:sz w:val="24"/>
+          <w:szCs w:val="24"/>
+          <w:lang w:val="en-US"/>
+        </w:rPr>
+        <w:t xml:space="preserve"> valid.</w:t>
+      </w:r>
+      <w:r>
+        <w:rPr>
+          <w:rFonts w:ascii="Times New Roman" w:hAnsi="Times New Roman" w:eastAsia="Times New Roman" w:cs="Times New Roman"/>
+          <w:noProof w:val="0"/>
+          <w:color w:val="000000" w:themeColor="text1" w:themeTint="FF" w:themeShade="FF"/>
+          <w:sz w:val="24"/>
+          <w:szCs w:val="24"/>
+          <w:lang w:val="en-US"/>
+        </w:rPr>
+        <w:t xml:space="preserve"> </w:t>
+      </w:r>
+      <w:r>
+        <w:rPr>
+          <w:rFonts w:ascii="Times New Roman" w:hAnsi="Times New Roman" w:eastAsia="Times New Roman" w:cs="Times New Roman"/>
+          <w:noProof w:val="0"/>
+          <w:color w:val="000000" w:themeColor="text1" w:themeTint="FF" w:themeShade="FF"/>
+          <w:sz w:val="24"/>
+          <w:szCs w:val="24"/>
+          <w:lang w:val="en-US"/>
+        </w:rPr>
+        <w:t>Seluruh</w:t>
+      </w:r>
+      <w:r>
+        <w:rPr>
+          <w:rFonts w:ascii="Times New Roman" w:hAnsi="Times New Roman" w:eastAsia="Times New Roman" w:cs="Times New Roman"/>
+          <w:noProof w:val="0"/>
+          <w:color w:val="000000" w:themeColor="text1" w:themeTint="FF" w:themeShade="FF"/>
+          <w:sz w:val="24"/>
+          <w:szCs w:val="24"/>
+          <w:lang w:val="en-US"/>
+        </w:rPr>
+        <w:t xml:space="preserve"> </w:t>
+      </w:r>
+      <w:r>
+        <w:rPr>
+          <w:rFonts w:ascii="Times New Roman" w:hAnsi="Times New Roman" w:eastAsia="Times New Roman" w:cs="Times New Roman"/>
+          <w:noProof w:val="0"/>
+          <w:color w:val="000000" w:themeColor="text1" w:themeTint="FF" w:themeShade="FF"/>
+          <w:sz w:val="24"/>
+          <w:szCs w:val="24"/>
+          <w:lang w:val="en-US"/>
+        </w:rPr>
+        <w:t>77 pemeriksaan</w:t>
+      </w:r>
+      <w:r>
+        <w:rPr>
+          <w:rFonts w:ascii="Times New Roman" w:hAnsi="Times New Roman" w:eastAsia="Times New Roman" w:cs="Times New Roman"/>
+          <w:noProof w:val="0"/>
+          <w:color w:val="000000" w:themeColor="text1" w:themeTint="FF" w:themeShade="FF"/>
+          <w:sz w:val="24"/>
+          <w:szCs w:val="24"/>
+          <w:lang w:val="en-US"/>
+        </w:rPr>
+        <w:t xml:space="preserve"> lulus.</w:t>
+      </w:r>
+    </w:p>
+    <w:p>
+      <w:pPr>
+        <w:pStyle w:val="Normal"/>
+        <w:ind w:left="284"/>
+        <w:jc w:val="both"/>
+      </w:pPr>
+      <w:r>
+        <w:drawing>
+          <wp:inline wp14:editId="6BA3FCD1" wp14:anchorId="710274BE">
+            <wp:extent cx="5669280" cy="1486039"/>
+            <wp:effectExtent l="0" t="0" r="0" b="0"/>
+            <wp:docPr id="1134196048" name="drawing"/>
+            <wp:cNvGraphicFramePr>
+              <a:graphicFrameLocks noChangeAspect="1"/>
+            </wp:cNvGraphicFramePr>
+            <a:graphic>
+              <a:graphicData xmlns:a="http://schemas.openxmlformats.org/drawingml/2006/main" uri="http://schemas.openxmlformats.org/drawingml/2006/picture">
+                <pic:pic xmlns:pic="http://schemas.openxmlformats.org/drawingml/2006/picture">
+                  <pic:nvPicPr>
+                    <pic:cNvPr id="1134196048" name="Picture 1134196048"/>
+                    <pic:cNvPicPr/>
+                  </pic:nvPicPr>
+                  <pic:blipFill>
+                    <a:blip xmlns:r="http://schemas.openxmlformats.org/officeDocument/2006/relationships" r:embed="rId592669462">
+                      <a:extLst>
+                        <a:ext uri="{28A0092B-C50C-407E-A947-70E740481C1C}">
+                          <a14:useLocalDpi xmlns:a14="http://schemas.microsoft.com/office/drawing/2010/main"/>
+                        </a:ext>
+                      </a:extLst>
+                    </a:blip>
+                    <a:stretch>
+                      <a:fillRect/>
+                    </a:stretch>
+                  </pic:blipFill>
+                  <pic:spPr>
+                    <a:xfrm rot="0">
+                      <a:off x="0" y="0"/>
+                      <a:ext cx="5669280" cy="1486039"/>
+                    </a:xfrm>
+                    <a:prstGeom prst="rect">
+                      <a:avLst/>
+                    </a:prstGeom>
+                  </pic:spPr>
+                </pic:pic>
+              </a:graphicData>
+            </a:graphic>
+          </wp:inline>
+        </w:drawing>
+      </w:r>
+    </w:p>
+    <w:p>
+      <w:pPr>
+        <w:spacing w:before="0" w:beforeAutospacing="off" w:after="120" w:afterAutospacing="off" w:line="276" w:lineRule="auto"/>
+        <w:jc w:val="both"/>
+      </w:pPr>
+      <w:r>
+        <w:rPr>
+          <w:rFonts w:ascii="Times New Roman" w:hAnsi="Times New Roman" w:eastAsia="Times New Roman" w:cs="Times New Roman"/>
+          <w:noProof w:val="0"/>
+          <w:color w:val="000000" w:themeColor="text1" w:themeTint="FF" w:themeShade="FF"/>
+          <w:sz w:val="24"/>
+          <w:szCs w:val="24"/>
+          <w:lang w:val="en-US"/>
+        </w:rPr>
+        <w:t>Gambar 4. Pengukuran waktu aktual pada salinan program sesuai instruksi.</w:t>
+      </w:r>
+    </w:p>
+    <w:p>
+      <w:pPr>
         <w:spacing w:before="200" w:beforeAutospacing="off" w:after="120" w:afterAutospacing="off"/>
         <w:jc w:val="both"/>
         <w:rPr>
@@ -7621,13 +9465,6 @@
       <w:pPr>
         <w:spacing w:before="0" w:beforeAutospacing="off" w:after="120" w:afterAutospacing="off" w:line="276" w:lineRule="auto"/>
         <w:jc w:val="both"/>
-        <w:rPr>
-          <w:rFonts w:ascii="Times New Roman" w:hAnsi="Times New Roman" w:eastAsia="Times New Roman" w:cs="Times New Roman"/>
-          <w:noProof w:val="0"/>
-          <w:sz w:val="24"/>
-          <w:szCs w:val="24"/>
-          <w:lang w:val="en-US"/>
-        </w:rPr>
       </w:pPr>
       <w:r>
         <w:rPr>
@@ -7712,7 +9549,7 @@
         </w:rPr>
         <w:t xml:space="preserve">Oracle. </w:t>
       </w:r>
-      <w:hyperlink r:id="Rc052c57d5a004d0c">
+      <w:hyperlink r:id="Rebb36770b2284689">
         <w:r>
           <w:rPr>
             <w:rStyle w:val="Hyperlink"/>
@@ -7775,7 +9612,7 @@
         </w:rPr>
         <w:t xml:space="preserve">Repository GitHub: </w:t>
       </w:r>
-      <w:hyperlink r:id="R619d09d6d08942f0">
+      <w:hyperlink r:id="R8c7998197b83401d">
         <w:r>
           <w:rPr>
             <w:rStyle w:val="Hyperlink"/>

</xml_diff>